<commit_message>
Removed redundant resumes and committed final resume
</commit_message>
<xml_diff>
--- a/StevenBui_Resume.docx
+++ b/StevenBui_Resume.docx
@@ -6,6 +6,7 @@
       <w:pPr>
         <w:pStyle w:val="Title"/>
         <w:rPr>
+          <w:rFonts w:ascii="Source Sans Pro" w:cs="Source Sans Pro" w:hAnsi="Source Sans Pro" w:eastAsia="Source Sans Pro"/>
           <w:sz w:val="28"/>
           <w:szCs w:val="28"/>
         </w:rPr>
@@ -14,6 +15,7 @@
       <w:bookmarkEnd w:id="0"/>
       <w:r>
         <w:rPr>
+          <w:rFonts w:ascii="Source Sans Pro" w:cs="Source Sans Pro" w:hAnsi="Source Sans Pro" w:eastAsia="Source Sans Pro"/>
           <w:sz w:val="28"/>
           <w:szCs w:val="28"/>
           <w:rtl w:val="0"/>
@@ -23,6 +25,7 @@
       </w:r>
       <w:r>
         <w:rPr>
+          <w:rFonts w:ascii="Source Sans Pro" w:cs="Source Sans Pro" w:hAnsi="Source Sans Pro" w:eastAsia="Source Sans Pro"/>
           <w:sz w:val="28"/>
           <w:szCs w:val="28"/>
           <w:rtl w:val="0"/>
@@ -36,7 +39,7 @@
       </w:r>
       <w:r>
         <w:rPr>
-          <w:rFonts w:ascii="Inter" w:cs="Inter" w:hAnsi="Inter" w:eastAsia="Inter"/>
+          <w:rFonts w:ascii="Source Sans Pro" w:cs="Source Sans Pro" w:hAnsi="Source Sans Pro" w:eastAsia="Source Sans Pro"/>
           <w:b w:val="0"/>
           <w:bCs w:val="0"/>
           <w:sz w:val="20"/>
@@ -49,10 +52,14 @@
     </w:p>
     <w:p>
       <w:pPr>
-        <w:pStyle w:val="Body"/>
-      </w:pPr>
-      <w:r>
-        <w:rPr>
+        <w:pStyle w:val="Body A"/>
+        <w:rPr>
+          <w:rFonts w:ascii="Source Sans Pro" w:cs="Source Sans Pro" w:hAnsi="Source Sans Pro" w:eastAsia="Source Sans Pro"/>
+        </w:rPr>
+      </w:pPr>
+      <w:r>
+        <w:rPr>
+          <w:rFonts w:ascii="Source Sans Pro" w:cs="Source Sans Pro" w:hAnsi="Source Sans Pro" w:eastAsia="Source Sans Pro"/>
           <w:rtl w:val="0"/>
           <w:lang w:val="es-ES_tradnl"/>
         </w:rPr>
@@ -66,45 +73,51 @@
       <w:r>
         <w:rPr>
           <w:rStyle w:val="Hyperlink.0"/>
+          <w:rFonts w:ascii="Source Sans Pro" w:cs="Source Sans Pro" w:hAnsi="Source Sans Pro" w:eastAsia="Source Sans Pro"/>
         </w:rPr>
         <w:fldChar w:fldCharType="begin" w:fldLock="0"/>
       </w:r>
       <w:r>
         <w:rPr>
           <w:rStyle w:val="Hyperlink.0"/>
+          <w:rFonts w:ascii="Source Sans Pro" w:cs="Source Sans Pro" w:hAnsi="Source Sans Pro" w:eastAsia="Source Sans Pro"/>
         </w:rPr>
         <w:instrText xml:space="preserve"> HYPERLINK "mailto:stevenbui79@yahoo.com"</w:instrText>
       </w:r>
       <w:r>
         <w:rPr>
           <w:rStyle w:val="Hyperlink.0"/>
+          <w:rFonts w:ascii="Source Sans Pro" w:cs="Source Sans Pro" w:hAnsi="Source Sans Pro" w:eastAsia="Source Sans Pro"/>
         </w:rPr>
         <w:fldChar w:fldCharType="separate" w:fldLock="0"/>
       </w:r>
       <w:r>
         <w:rPr>
           <w:rStyle w:val="Hyperlink.0"/>
+          <w:rFonts w:ascii="Source Sans Pro" w:cs="Source Sans Pro" w:hAnsi="Source Sans Pro" w:eastAsia="Source Sans Pro"/>
           <w:rtl w:val="0"/>
           <w:lang w:val="nl-NL"/>
         </w:rPr>
         <w:t>stevenbui79@yahoo.com</w:t>
       </w:r>
       <w:r>
-        <w:rPr/>
+        <w:rPr>
+          <w:rFonts w:ascii="Source Sans Pro" w:cs="Source Sans Pro" w:hAnsi="Source Sans Pro" w:eastAsia="Source Sans Pro"/>
+        </w:rPr>
         <w:fldChar w:fldCharType="end" w:fldLock="0"/>
       </w:r>
       <w:r>
         <w:rPr>
-          <w:rStyle w:val="None"/>
+          <w:rFonts w:ascii="Source Sans Pro" w:cs="Source Sans Pro" w:hAnsi="Source Sans Pro" w:eastAsia="Source Sans Pro"/>
         </w:rPr>
         <w:tab/>
       </w:r>
     </w:p>
     <w:p>
       <w:pPr>
-        <w:pStyle w:val="Body"/>
-        <w:rPr>
-          <w:rStyle w:val="None"/>
+        <w:pStyle w:val="Body A"/>
+        <w:rPr>
+          <w:rFonts w:ascii="Source Sans Pro" w:cs="Source Sans Pro" w:hAnsi="Source Sans Pro" w:eastAsia="Source Sans Pro"/>
           <w:sz w:val="20"/>
           <w:szCs w:val="20"/>
         </w:rPr>
@@ -115,6 +128,7 @@
         <w:pStyle w:val="Heading"/>
         <w:rPr>
           <w:rStyle w:val="None"/>
+          <w:rFonts w:ascii="Source Sans Pro" w:cs="Source Sans Pro" w:hAnsi="Source Sans Pro" w:eastAsia="Source Sans Pro"/>
           <w:sz w:val="20"/>
           <w:szCs w:val="20"/>
         </w:rPr>
@@ -124,6 +138,7 @@
       <w:r>
         <w:rPr>
           <w:rStyle w:val="None"/>
+          <w:rFonts w:ascii="Source Sans Pro" w:cs="Source Sans Pro" w:hAnsi="Source Sans Pro" w:eastAsia="Source Sans Pro"/>
           <w:sz w:val="20"/>
           <w:szCs w:val="20"/>
           <w:rtl w:val="0"/>
@@ -133,6 +148,7 @@
       <w:r>
         <w:rPr>
           <w:rStyle w:val="None"/>
+          <w:rFonts w:ascii="Source Sans Pro" w:cs="Source Sans Pro" w:hAnsi="Source Sans Pro" w:eastAsia="Source Sans Pro"/>
           <w:sz w:val="20"/>
           <w:szCs w:val="20"/>
           <w:rtl w:val="0"/>
@@ -143,71 +159,39 @@
     </w:p>
     <w:p>
       <w:pPr>
-        <w:pStyle w:val="Body"/>
-        <w:rPr>
-          <w:rStyle w:val="None"/>
-          <w:sz w:val="20"/>
-          <w:szCs w:val="20"/>
-        </w:rPr>
-      </w:pPr>
-      <w:r>
-        <w:rPr>
-          <w:rStyle w:val="None"/>
-          <w:sz w:val="20"/>
-          <w:szCs w:val="20"/>
-          <w:rtl w:val="0"/>
-          <w:lang w:val="en-US"/>
-        </w:rPr>
-        <w:t xml:space="preserve">Platform Cloud engineering leader with experience across DevOps and Infrastructure.  Hands on experience building cloud-native platforms, CI/CD deployment, and infrastructure design across AWS and Alibaba Cloud services. </w:t>
-      </w:r>
-      <w:r>
-        <w:rPr>
-          <w:rStyle w:val="None"/>
-          <w:caps w:val="0"/>
-          <w:smallCaps w:val="0"/>
-          <w:strike w:val="0"/>
-          <w:dstrike w:val="0"/>
-          <w:outline w:val="0"/>
-          <w:color w:val="1f1f1f"/>
-          <w:sz w:val="20"/>
-          <w:szCs w:val="20"/>
-          <w:u w:val="none" w:color="1f1f1f"/>
-          <w:shd w:val="nil" w:color="auto" w:fill="auto"/>
-          <w:vertAlign w:val="baseline"/>
-          <w:rtl w:val="0"/>
-          <w:lang w:val="en-US"/>
-          <w14:textFill>
-            <w14:solidFill>
-              <w14:srgbClr w14:val="1F1F1F"/>
-            </w14:solidFill>
-          </w14:textFill>
-        </w:rPr>
-        <w:t xml:space="preserve">Possesses versatile skills, capable of single-handedly delivering projects or providing team leadership. </w:t>
-      </w:r>
-      <w:r>
-        <w:rPr>
-          <w:rStyle w:val="None"/>
-          <w:sz w:val="20"/>
-          <w:szCs w:val="20"/>
-          <w:rtl w:val="0"/>
-          <w:lang w:val="en-US"/>
-        </w:rPr>
-        <w:t xml:space="preserve">An individual who loves designing infrastructure and enjoys being challenged. </w:t>
-      </w:r>
-    </w:p>
-    <w:p>
-      <w:pPr>
-        <w:pStyle w:val="Body"/>
-        <w:rPr>
-          <w:rStyle w:val="None"/>
-          <w:sz w:val="20"/>
-          <w:szCs w:val="20"/>
-        </w:rPr>
-      </w:pPr>
-    </w:p>
-    <w:p>
-      <w:pPr>
-        <w:pStyle w:val="Body"/>
+        <w:pStyle w:val="Body A"/>
+        <w:rPr>
+          <w:rStyle w:val="None"/>
+          <w:rFonts w:ascii="Source Sans Pro" w:cs="Source Sans Pro" w:hAnsi="Source Sans Pro" w:eastAsia="Source Sans Pro"/>
+          <w:sz w:val="20"/>
+          <w:szCs w:val="20"/>
+        </w:rPr>
+      </w:pPr>
+      <w:r>
+        <w:rPr>
+          <w:rStyle w:val="None"/>
+          <w:rFonts w:ascii="Source Sans Pro" w:cs="Source Sans Pro" w:hAnsi="Source Sans Pro" w:eastAsia="Source Sans Pro"/>
+          <w:sz w:val="20"/>
+          <w:szCs w:val="20"/>
+          <w:rtl w:val="0"/>
+          <w:lang w:val="en-US"/>
+        </w:rPr>
+        <w:t>Cloud and platform engineering leader with experience delivering cloud-native infrastructure, CI/CD automation, and regulated enterprise platforms across AWS, Alibaba Cloud, OpenStack, and hybrid environments. Proven record of leading cross-functional delivery, modernizing deployment systems, and shipping secure, scalable solutions in complex enterprise and compliance-heavy settings.</w:t>
+      </w:r>
+    </w:p>
+    <w:p>
+      <w:pPr>
+        <w:pStyle w:val="Body A"/>
+        <w:rPr>
+          <w:rFonts w:ascii="Source Sans Pro" w:cs="Source Sans Pro" w:hAnsi="Source Sans Pro" w:eastAsia="Source Sans Pro"/>
+          <w:sz w:val="20"/>
+          <w:szCs w:val="20"/>
+        </w:rPr>
+      </w:pPr>
+    </w:p>
+    <w:p>
+      <w:pPr>
+        <w:pStyle w:val="Body A"/>
         <w:spacing w:line="240" w:lineRule="auto"/>
         <w:rPr>
           <w:rStyle w:val="None"/>
@@ -245,12 +229,12 @@
             </w14:solidFill>
           </w14:textFill>
         </w:rPr>
-        <w:t>LANGUAGES AND TECHNOLOGIES</w:t>
-      </w:r>
-    </w:p>
-    <w:p>
-      <w:pPr>
-        <w:pStyle w:val="Body"/>
+        <w:t>Skills</w:t>
+      </w:r>
+    </w:p>
+    <w:p>
+      <w:pPr>
+        <w:pStyle w:val="Body A"/>
         <w:numPr>
           <w:ilvl w:val="0"/>
           <w:numId w:val="2"/>
@@ -278,8 +262,6 @@
         <w:rPr>
           <w:rStyle w:val="None"/>
           <w:rFonts w:ascii="Source Sans Pro" w:cs="Source Sans Pro" w:hAnsi="Source Sans Pro" w:eastAsia="Source Sans Pro"/>
-          <w:b w:val="1"/>
-          <w:bCs w:val="1"/>
           <w:outline w:val="0"/>
           <w:color w:val="434343"/>
           <w:sz w:val="20"/>
@@ -293,31 +275,12 @@
             </w14:solidFill>
           </w14:textFill>
         </w:rPr>
-        <w:t>Proficient:</w:t>
-      </w:r>
-      <w:r>
-        <w:rPr>
-          <w:rStyle w:val="None"/>
-          <w:rFonts w:ascii="Source Sans Pro" w:cs="Source Sans Pro" w:hAnsi="Source Sans Pro" w:eastAsia="Source Sans Pro"/>
-          <w:outline w:val="0"/>
-          <w:color w:val="434343"/>
-          <w:sz w:val="20"/>
-          <w:szCs w:val="20"/>
-          <w:u w:color="434343"/>
-          <w:rtl w:val="0"/>
-          <w:lang w:val="en-US"/>
-          <w14:textFill>
-            <w14:solidFill>
-              <w14:srgbClr w14:val="434343"/>
-            </w14:solidFill>
-          </w14:textFill>
-        </w:rPr>
-        <w:t xml:space="preserve"> Python, C++, Kubernetes, Shell Scripting</w:t>
-      </w:r>
-    </w:p>
-    <w:p>
-      <w:pPr>
-        <w:pStyle w:val="Body"/>
+        <w:t>Languages: Python, C++, Shell Scripting.</w:t>
+      </w:r>
+    </w:p>
+    <w:p>
+      <w:pPr>
+        <w:pStyle w:val="Body A"/>
         <w:numPr>
           <w:ilvl w:val="0"/>
           <w:numId w:val="2"/>
@@ -333,7 +296,6 @@
           <w:sz w:val="20"/>
           <w:szCs w:val="20"/>
           <w:rtl w:val="0"/>
-          <w:lang w:val="en-US"/>
           <w14:textFill>
             <w14:solidFill>
               <w14:srgbClr w14:val="434343"/>
@@ -345,8 +307,6 @@
         <w:rPr>
           <w:rStyle w:val="None"/>
           <w:rFonts w:ascii="Source Sans Pro" w:cs="Source Sans Pro" w:hAnsi="Source Sans Pro" w:eastAsia="Source Sans Pro"/>
-          <w:b w:val="1"/>
-          <w:bCs w:val="1"/>
           <w:outline w:val="0"/>
           <w:color w:val="434343"/>
           <w:sz w:val="20"/>
@@ -360,30 +320,13 @@
             </w14:solidFill>
           </w14:textFill>
         </w:rPr>
-        <w:t>Cloud Infrastructure:</w:t>
-      </w:r>
-      <w:r>
-        <w:rPr>
-          <w:rStyle w:val="None"/>
-          <w:rFonts w:ascii="Source Sans Pro" w:cs="Source Sans Pro" w:hAnsi="Source Sans Pro" w:eastAsia="Source Sans Pro"/>
-          <w:outline w:val="0"/>
-          <w:color w:val="434343"/>
-          <w:sz w:val="20"/>
-          <w:szCs w:val="20"/>
-          <w:u w:color="434343"/>
-          <w:rtl w:val="0"/>
-          <w14:textFill>
-            <w14:solidFill>
-              <w14:srgbClr w14:val="434343"/>
-            </w14:solidFill>
-          </w14:textFill>
-        </w:rPr>
-        <w:t xml:space="preserve"> Amazon Web Services, Alibaba Cloud Services, Openstack</w:t>
-      </w:r>
-    </w:p>
-    <w:p>
-      <w:pPr>
-        <w:pStyle w:val="Body"/>
+        <w:tab/>
+        <w:t>Cloud and Infrastructure: AWS, Alibaba Cloud, OpenStack, Kubernetes, Docker, Terraform.</w:t>
+      </w:r>
+    </w:p>
+    <w:p>
+      <w:pPr>
+        <w:pStyle w:val="Body A"/>
         <w:numPr>
           <w:ilvl w:val="0"/>
           <w:numId w:val="2"/>
@@ -399,7 +342,6 @@
           <w:sz w:val="20"/>
           <w:szCs w:val="20"/>
           <w:rtl w:val="0"/>
-          <w:lang w:val="en-US"/>
           <w14:textFill>
             <w14:solidFill>
               <w14:srgbClr w14:val="434343"/>
@@ -411,8 +353,6 @@
         <w:rPr>
           <w:rStyle w:val="None"/>
           <w:rFonts w:ascii="Source Sans Pro" w:cs="Source Sans Pro" w:hAnsi="Source Sans Pro" w:eastAsia="Source Sans Pro"/>
-          <w:b w:val="1"/>
-          <w:bCs w:val="1"/>
           <w:outline w:val="0"/>
           <w:color w:val="434343"/>
           <w:sz w:val="20"/>
@@ -426,35 +366,62 @@
             </w14:solidFill>
           </w14:textFill>
         </w:rPr>
-        <w:t>Skills</w:t>
-      </w:r>
-      <w:r>
-        <w:rPr>
-          <w:rStyle w:val="None"/>
+        <w:tab/>
+        <w:t>Delivery and Automation: CI/CD, Jenkins, Chef, cloud-native buildpacks, infrastructure design.</w:t>
+      </w:r>
+    </w:p>
+    <w:p>
+      <w:pPr>
+        <w:pStyle w:val="Body A"/>
+        <w:numPr>
+          <w:ilvl w:val="0"/>
+          <w:numId w:val="2"/>
+        </w:numPr>
+        <w:bidi w:val="0"/>
+        <w:spacing w:line="240" w:lineRule="auto"/>
+        <w:ind w:right="0"/>
+        <w:jc w:val="left"/>
+        <w:rPr>
           <w:rFonts w:ascii="Source Sans Pro" w:cs="Source Sans Pro" w:hAnsi="Source Sans Pro" w:eastAsia="Source Sans Pro"/>
           <w:outline w:val="0"/>
           <w:color w:val="434343"/>
           <w:sz w:val="20"/>
           <w:szCs w:val="20"/>
-          <w:u w:color="434343"/>
-          <w:rtl w:val="0"/>
-          <w:lang w:val="en-US"/>
+          <w:rtl w:val="0"/>
           <w14:textFill>
             <w14:solidFill>
               <w14:srgbClr w14:val="434343"/>
             </w14:solidFill>
           </w14:textFill>
         </w:rPr>
-        <w:t>: Scrum master, Cloud Infrastructure Design, all flavors of Linux OS</w:t>
-      </w:r>
-    </w:p>
-    <w:p>
-      <w:pPr>
-        <w:pStyle w:val="Body"/>
+      </w:pPr>
+      <w:r>
+        <w:rPr>
+          <w:rStyle w:val="None"/>
+          <w:rFonts w:ascii="Source Sans Pro" w:cs="Source Sans Pro" w:hAnsi="Source Sans Pro" w:eastAsia="Source Sans Pro"/>
+          <w:outline w:val="0"/>
+          <w:color w:val="434343"/>
+          <w:sz w:val="20"/>
+          <w:szCs w:val="20"/>
+          <w:u w:color="434343"/>
+          <w:rtl w:val="0"/>
+          <w:lang w:val="en-US"/>
+          <w14:textFill>
+            <w14:solidFill>
+              <w14:srgbClr w14:val="434343"/>
+            </w14:solidFill>
+          </w14:textFill>
+        </w:rPr>
+        <w:tab/>
+        <w:t>Methods: Agile/Scrum, cross-functional leadership, solution architecture, platform engineering.</w:t>
+      </w:r>
+    </w:p>
+    <w:p>
+      <w:pPr>
+        <w:pStyle w:val="Body A"/>
         <w:spacing w:line="240" w:lineRule="auto"/>
         <w:ind w:left="720" w:firstLine="0"/>
         <w:rPr>
-          <w:rStyle w:val="None"/>
           <w:rFonts w:ascii="Source Sans Pro" w:cs="Source Sans Pro" w:hAnsi="Source Sans Pro" w:eastAsia="Source Sans Pro"/>
           <w:outline w:val="0"/>
           <w:color w:val="434343"/>
@@ -471,7 +438,16 @@
     </w:p>
     <w:p>
       <w:pPr>
-        <w:pStyle w:val="Body"/>
+        <w:pStyle w:val="Body A"/>
+        <w:spacing w:line="240" w:lineRule="auto"/>
+        <w:rPr>
+          <w:rFonts w:ascii="Source Sans Pro" w:cs="Source Sans Pro" w:hAnsi="Source Sans Pro" w:eastAsia="Source Sans Pro"/>
+        </w:rPr>
+      </w:pPr>
+    </w:p>
+    <w:p>
+      <w:pPr>
+        <w:pStyle w:val="Body A"/>
         <w:spacing w:line="240" w:lineRule="auto"/>
         <w:rPr>
           <w:rStyle w:val="None"/>
@@ -514,7 +490,7 @@
     </w:p>
     <w:p>
       <w:pPr>
-        <w:pStyle w:val="Body"/>
+        <w:pStyle w:val="Body A"/>
         <w:numPr>
           <w:ilvl w:val="0"/>
           <w:numId w:val="4"/>
@@ -523,15 +499,17 @@
         <w:ind w:right="0"/>
         <w:jc w:val="left"/>
         <w:rPr>
-          <w:sz w:val="20"/>
-          <w:szCs w:val="20"/>
-          <w:rtl w:val="0"/>
-          <w:lang w:val="en-US"/>
-        </w:rPr>
-      </w:pPr>
-      <w:r>
-        <w:rPr>
-          <w:rStyle w:val="None"/>
+          <w:rFonts w:ascii="Source Sans Pro" w:cs="Source Sans Pro" w:hAnsi="Source Sans Pro" w:eastAsia="Source Sans Pro"/>
+          <w:sz w:val="20"/>
+          <w:szCs w:val="20"/>
+          <w:rtl w:val="0"/>
+          <w:lang w:val="en-US"/>
+        </w:rPr>
+      </w:pPr>
+      <w:r>
+        <w:rPr>
+          <w:rStyle w:val="None"/>
+          <w:rFonts w:ascii="Source Sans Pro" w:cs="Source Sans Pro" w:hAnsi="Source Sans Pro" w:eastAsia="Source Sans Pro"/>
           <w:sz w:val="20"/>
           <w:szCs w:val="20"/>
           <w:rtl w:val="0"/>
@@ -542,7 +520,7 @@
     </w:p>
     <w:p>
       <w:pPr>
-        <w:pStyle w:val="Body"/>
+        <w:pStyle w:val="Body A"/>
         <w:numPr>
           <w:ilvl w:val="0"/>
           <w:numId w:val="4"/>
@@ -551,14 +529,15 @@
         <w:ind w:right="0"/>
         <w:jc w:val="left"/>
         <w:rPr>
-          <w:sz w:val="20"/>
-          <w:szCs w:val="20"/>
-          <w:rtl w:val="0"/>
-        </w:rPr>
-      </w:pPr>
-      <w:r>
-        <w:rPr>
-          <w:rStyle w:val="None"/>
+          <w:rFonts w:ascii="Source Sans Pro" w:cs="Source Sans Pro" w:hAnsi="Source Sans Pro" w:eastAsia="Source Sans Pro"/>
+          <w:sz w:val="20"/>
+          <w:szCs w:val="20"/>
+          <w:rtl w:val="0"/>
+        </w:rPr>
+      </w:pPr>
+      <w:r>
+        <w:rPr>
+          <w:rFonts w:ascii="Source Sans Pro" w:cs="Source Sans Pro" w:hAnsi="Source Sans Pro" w:eastAsia="Source Sans Pro"/>
           <w:sz w:val="20"/>
           <w:szCs w:val="20"/>
           <w:rtl w:val="0"/>
@@ -568,20 +547,63 @@
     </w:p>
     <w:p>
       <w:pPr>
-        <w:pStyle w:val="Body"/>
-        <w:rPr>
-          <w:rStyle w:val="None"/>
-          <w:sz w:val="20"/>
-          <w:szCs w:val="20"/>
-        </w:rPr>
-      </w:pPr>
-    </w:p>
-    <w:p>
-      <w:pPr>
-        <w:pStyle w:val="Body"/>
-        <w:rPr>
-          <w:rStyle w:val="None"/>
-          <w:rFonts w:ascii="Inter" w:cs="Inter" w:hAnsi="Inter" w:eastAsia="Inter"/>
+        <w:pStyle w:val="Body A"/>
+        <w:numPr>
+          <w:ilvl w:val="0"/>
+          <w:numId w:val="4"/>
+        </w:numPr>
+        <w:bidi w:val="0"/>
+        <w:ind w:right="0"/>
+        <w:jc w:val="left"/>
+        <w:rPr>
+          <w:rFonts w:ascii="Source Sans Pro" w:cs="Source Sans Pro" w:hAnsi="Source Sans Pro" w:eastAsia="Source Sans Pro"/>
+          <w:sz w:val="20"/>
+          <w:szCs w:val="20"/>
+          <w:rtl w:val="0"/>
+          <w:lang w:val="en-US"/>
+        </w:rPr>
+      </w:pPr>
+      <w:r>
+        <w:rPr>
+          <w:rFonts w:ascii="Source Sans Pro" w:cs="Source Sans Pro" w:hAnsi="Source Sans Pro" w:eastAsia="Source Sans Pro"/>
+          <w:sz w:val="20"/>
+          <w:szCs w:val="20"/>
+          <w:rtl w:val="0"/>
+          <w:lang w:val="en-US"/>
+        </w:rPr>
+        <w:t>Salesforce Scrum Master</w:t>
+      </w:r>
+    </w:p>
+    <w:p>
+      <w:pPr>
+        <w:pStyle w:val="Body A"/>
+        <w:bidi w:val="0"/>
+        <w:ind w:left="0" w:right="0" w:firstLine="0"/>
+        <w:jc w:val="left"/>
+        <w:rPr>
+          <w:rFonts w:ascii="Source Sans Pro" w:cs="Source Sans Pro" w:hAnsi="Source Sans Pro" w:eastAsia="Source Sans Pro"/>
+          <w:sz w:val="20"/>
+          <w:szCs w:val="20"/>
+          <w:rtl w:val="0"/>
+        </w:rPr>
+      </w:pPr>
+    </w:p>
+    <w:p>
+      <w:pPr>
+        <w:pStyle w:val="Body A"/>
+        <w:rPr>
+          <w:rFonts w:ascii="Source Sans Pro" w:cs="Source Sans Pro" w:hAnsi="Source Sans Pro" w:eastAsia="Source Sans Pro"/>
+          <w:sz w:val="20"/>
+          <w:szCs w:val="20"/>
+        </w:rPr>
+      </w:pPr>
+    </w:p>
+    <w:p>
+      <w:pPr>
+        <w:pStyle w:val="Body A"/>
+        <w:rPr>
+          <w:rStyle w:val="None"/>
+          <w:rFonts w:ascii="Source Sans Pro" w:cs="Source Sans Pro" w:hAnsi="Source Sans Pro" w:eastAsia="Source Sans Pro"/>
           <w:b w:val="1"/>
           <w:bCs w:val="1"/>
           <w:sz w:val="20"/>
@@ -591,7 +613,7 @@
       <w:r>
         <w:rPr>
           <w:rStyle w:val="None"/>
-          <w:rFonts w:ascii="Inter" w:cs="Inter" w:hAnsi="Inter" w:eastAsia="Inter"/>
+          <w:rFonts w:ascii="Source Sans Pro" w:cs="Source Sans Pro" w:hAnsi="Source Sans Pro" w:eastAsia="Source Sans Pro"/>
           <w:b w:val="1"/>
           <w:bCs w:val="1"/>
           <w:sz w:val="20"/>
@@ -604,16 +626,26 @@
     </w:p>
     <w:p>
       <w:pPr>
-        <w:pStyle w:val="Body"/>
-        <w:rPr>
-          <w:rStyle w:val="None"/>
-          <w:sz w:val="20"/>
-          <w:szCs w:val="20"/>
-        </w:rPr>
-      </w:pPr>
-      <w:r>
-        <w:rPr>
-          <w:rStyle w:val="None"/>
+        <w:pStyle w:val="Body A"/>
+        <w:rPr>
+          <w:rStyle w:val="None"/>
+          <w:rFonts w:ascii="Source Sans Pro" w:cs="Source Sans Pro" w:hAnsi="Source Sans Pro" w:eastAsia="Source Sans Pro"/>
+          <w:sz w:val="20"/>
+          <w:szCs w:val="20"/>
+        </w:rPr>
+      </w:pPr>
+      <w:r>
+        <w:rPr>
+          <w:rStyle w:val="None"/>
+          <w:rFonts w:ascii="Source Sans Pro" w:cs="Source Sans Pro" w:hAnsi="Source Sans Pro" w:eastAsia="Source Sans Pro"/>
+          <w:outline w:val="0"/>
+          <w:color w:val="000000"/>
+          <w:u w:color="000000"/>
+          <w14:textFill>
+            <w14:solidFill>
+              <w14:srgbClr w14:val="000000"/>
+            </w14:solidFill>
+          </w14:textFill>
         </w:rPr>
         <mc:AlternateContent>
           <mc:Choice Requires="wps">
@@ -667,6 +699,7 @@
         <w:pStyle w:val="Heading 2"/>
         <w:rPr>
           <w:rStyle w:val="None"/>
+          <w:rFonts w:ascii="Source Sans Pro" w:cs="Source Sans Pro" w:hAnsi="Source Sans Pro" w:eastAsia="Source Sans Pro"/>
           <w:sz w:val="20"/>
           <w:szCs w:val="20"/>
         </w:rPr>
@@ -676,6 +709,7 @@
       <w:r>
         <w:rPr>
           <w:rStyle w:val="None"/>
+          <w:rFonts w:ascii="Source Sans Pro" w:cs="Source Sans Pro" w:hAnsi="Source Sans Pro" w:eastAsia="Source Sans Pro"/>
           <w:sz w:val="20"/>
           <w:szCs w:val="20"/>
           <w:rtl w:val="0"/>
@@ -685,25 +719,29 @@
       <w:r>
         <w:rPr>
           <w:rStyle w:val="None"/>
-          <w:sz w:val="20"/>
-          <w:szCs w:val="20"/>
-          <w:rtl w:val="0"/>
-        </w:rPr>
-        <w:t>rincipal Software Engineer | Director</w:t>
-      </w:r>
-    </w:p>
-    <w:p>
-      <w:pPr>
-        <w:pStyle w:val="Body"/>
-        <w:rPr>
-          <w:rStyle w:val="None"/>
-          <w:sz w:val="20"/>
-          <w:szCs w:val="20"/>
-        </w:rPr>
-      </w:pPr>
-      <w:r>
-        <w:rPr>
-          <w:rStyle w:val="None"/>
+          <w:rFonts w:ascii="Source Sans Pro" w:cs="Source Sans Pro" w:hAnsi="Source Sans Pro" w:eastAsia="Source Sans Pro"/>
+          <w:sz w:val="20"/>
+          <w:szCs w:val="20"/>
+          <w:rtl w:val="0"/>
+          <w:lang w:val="en-US"/>
+        </w:rPr>
+        <w:t>rincipal Software Engineer</w:t>
+      </w:r>
+    </w:p>
+    <w:p>
+      <w:pPr>
+        <w:pStyle w:val="Body A"/>
+        <w:rPr>
+          <w:rStyle w:val="None"/>
+          <w:rFonts w:ascii="Source Sans Pro" w:cs="Source Sans Pro" w:hAnsi="Source Sans Pro" w:eastAsia="Source Sans Pro"/>
+          <w:sz w:val="20"/>
+          <w:szCs w:val="20"/>
+        </w:rPr>
+      </w:pPr>
+      <w:r>
+        <w:rPr>
+          <w:rStyle w:val="None"/>
+          <w:rFonts w:ascii="Source Sans Pro" w:cs="Source Sans Pro" w:hAnsi="Source Sans Pro" w:eastAsia="Source Sans Pro"/>
           <w:sz w:val="20"/>
           <w:szCs w:val="20"/>
           <w:rtl w:val="0"/>
@@ -719,36 +757,43 @@
       <w:r>
         <w:rPr>
           <w:rStyle w:val="Hyperlink.1"/>
+          <w:rFonts w:ascii="Source Sans Pro" w:cs="Source Sans Pro" w:hAnsi="Source Sans Pro" w:eastAsia="Source Sans Pro"/>
         </w:rPr>
         <w:fldChar w:fldCharType="begin" w:fldLock="0"/>
       </w:r>
       <w:r>
         <w:rPr>
           <w:rStyle w:val="Hyperlink.1"/>
+          <w:rFonts w:ascii="Source Sans Pro" w:cs="Source Sans Pro" w:hAnsi="Source Sans Pro" w:eastAsia="Source Sans Pro"/>
         </w:rPr>
         <w:instrText xml:space="preserve"> HYPERLINK "https://www.google.com/maps/place/San+Francisco/data=!4m2!3m1!19sChIJIQBpAG2ahYAR_6128GcTUEo"</w:instrText>
       </w:r>
       <w:r>
         <w:rPr>
           <w:rStyle w:val="Hyperlink.1"/>
+          <w:rFonts w:ascii="Source Sans Pro" w:cs="Source Sans Pro" w:hAnsi="Source Sans Pro" w:eastAsia="Source Sans Pro"/>
         </w:rPr>
         <w:fldChar w:fldCharType="separate" w:fldLock="0"/>
       </w:r>
       <w:r>
         <w:rPr>
           <w:rStyle w:val="Hyperlink.1"/>
+          <w:rFonts w:ascii="Source Sans Pro" w:cs="Source Sans Pro" w:hAnsi="Source Sans Pro" w:eastAsia="Source Sans Pro"/>
           <w:rtl w:val="0"/>
           <w:lang w:val="it-IT"/>
         </w:rPr>
         <w:t>San Francisco</w:t>
       </w:r>
       <w:r>
-        <w:rPr/>
+        <w:rPr>
+          <w:rFonts w:ascii="Source Sans Pro" w:cs="Source Sans Pro" w:hAnsi="Source Sans Pro" w:eastAsia="Source Sans Pro"/>
+        </w:rPr>
         <w:fldChar w:fldCharType="end" w:fldLock="0"/>
       </w:r>
       <w:r>
         <w:rPr>
           <w:rStyle w:val="None"/>
+          <w:rFonts w:ascii="Source Sans Pro" w:cs="Source Sans Pro" w:hAnsi="Source Sans Pro" w:eastAsia="Source Sans Pro"/>
           <w:sz w:val="20"/>
           <w:szCs w:val="20"/>
           <w:rtl w:val="0"/>
@@ -761,6 +806,7 @@
       <w:r>
         <w:rPr>
           <w:rStyle w:val="None"/>
+          <w:rFonts w:ascii="Source Sans Pro" w:cs="Source Sans Pro" w:hAnsi="Source Sans Pro" w:eastAsia="Source Sans Pro"/>
           <w:sz w:val="20"/>
           <w:szCs w:val="20"/>
           <w:rtl w:val="0"/>
@@ -770,6 +816,7 @@
       <w:r>
         <w:rPr>
           <w:rStyle w:val="None"/>
+          <w:rFonts w:ascii="Source Sans Pro" w:cs="Source Sans Pro" w:hAnsi="Source Sans Pro" w:eastAsia="Source Sans Pro"/>
           <w:sz w:val="20"/>
           <w:szCs w:val="20"/>
           <w:rtl w:val="0"/>
@@ -780,18 +827,32 @@
     </w:p>
     <w:p>
       <w:pPr>
-        <w:pStyle w:val="Body"/>
+        <w:pStyle w:val="Body A"/>
         <w:widowControl w:val="0"/>
         <w:rPr>
-          <w:rStyle w:val="None"/>
-          <w:sz w:val="20"/>
-          <w:szCs w:val="20"/>
-        </w:rPr>
-      </w:pPr>
-    </w:p>
-    <w:p>
-      <w:pPr>
-        <w:pStyle w:val="Body"/>
+          <w:rFonts w:ascii="Source Sans Pro" w:cs="Source Sans Pro" w:hAnsi="Source Sans Pro" w:eastAsia="Source Sans Pro"/>
+          <w:sz w:val="20"/>
+          <w:szCs w:val="20"/>
+        </w:rPr>
+      </w:pPr>
+    </w:p>
+    <w:p>
+      <w:pPr>
+        <w:pStyle w:val="Body A"/>
+        <w:bidi w:val="0"/>
+        <w:ind w:left="0" w:right="0" w:firstLine="0"/>
+        <w:jc w:val="left"/>
+        <w:rPr>
+          <w:rFonts w:ascii="Source Sans Pro" w:cs="Source Sans Pro" w:hAnsi="Source Sans Pro" w:eastAsia="Source Sans Pro"/>
+          <w:sz w:val="20"/>
+          <w:szCs w:val="20"/>
+          <w:rtl w:val="0"/>
+        </w:rPr>
+      </w:pPr>
+    </w:p>
+    <w:p>
+      <w:pPr>
+        <w:pStyle w:val="Body A"/>
         <w:numPr>
           <w:ilvl w:val="0"/>
           <w:numId w:val="4"/>
@@ -800,45 +861,27 @@
         <w:ind w:right="0"/>
         <w:jc w:val="left"/>
         <w:rPr>
-          <w:sz w:val="20"/>
-          <w:szCs w:val="20"/>
-          <w:rtl w:val="0"/>
-          <w:lang w:val="en-US"/>
-        </w:rPr>
-      </w:pPr>
-      <w:r>
-        <w:rPr>
-          <w:rStyle w:val="None"/>
-          <w:sz w:val="20"/>
-          <w:szCs w:val="20"/>
-          <w:rtl w:val="0"/>
-          <w:lang w:val="en-US"/>
-        </w:rPr>
-        <w:t>Implemented Cloud Native Buildpacks (CNBs) from buildpacks.io to integrate seamlessly with Salesforce</w:t>
-      </w:r>
-      <w:r>
-        <w:rPr>
-          <w:rStyle w:val="None"/>
-          <w:sz w:val="20"/>
-          <w:szCs w:val="20"/>
-          <w:rtl w:val="1"/>
-        </w:rPr>
-        <w:t>’</w:t>
-      </w:r>
-      <w:r>
-        <w:rPr>
-          <w:rStyle w:val="None"/>
-          <w:sz w:val="20"/>
-          <w:szCs w:val="20"/>
-          <w:rtl w:val="0"/>
-          <w:lang w:val="en-US"/>
-        </w:rPr>
-        <w:t>s multi-substrate addon tooling, enabling automated container image creation, consistent build environments, and improved deployment workflows across multiple substrates.</w:t>
-      </w:r>
-    </w:p>
-    <w:p>
-      <w:pPr>
-        <w:pStyle w:val="Body"/>
+          <w:rFonts w:ascii="Source Sans Pro" w:cs="Source Sans Pro" w:hAnsi="Source Sans Pro" w:eastAsia="Source Sans Pro"/>
+          <w:sz w:val="20"/>
+          <w:szCs w:val="20"/>
+          <w:rtl w:val="0"/>
+        </w:rPr>
+      </w:pPr>
+      <w:r>
+        <w:rPr>
+          <w:rFonts w:ascii="Source Sans Pro" w:cs="Source Sans Pro" w:hAnsi="Source Sans Pro" w:eastAsia="Source Sans Pro"/>
+          <w:sz w:val="20"/>
+          <w:szCs w:val="20"/>
+          <w:rtl w:val="0"/>
+          <w:lang w:val="en-US"/>
+        </w:rPr>
+        <w:tab/>
+        <w:t>Served as a Forward Deployed Engineer embedded across product, legal, and partner teams to deliver China-specific and air-gapped infrastructure for Salesforce and Alibaba Cloud.</w:t>
+      </w:r>
+    </w:p>
+    <w:p>
+      <w:pPr>
+        <w:pStyle w:val="Body A"/>
         <w:numPr>
           <w:ilvl w:val="0"/>
           <w:numId w:val="4"/>
@@ -847,26 +890,27 @@
         <w:ind w:right="0"/>
         <w:jc w:val="left"/>
         <w:rPr>
-          <w:sz w:val="20"/>
-          <w:szCs w:val="20"/>
-          <w:rtl w:val="0"/>
-          <w:lang w:val="en-US"/>
-        </w:rPr>
-      </w:pPr>
-      <w:r>
-        <w:rPr>
-          <w:rStyle w:val="None"/>
-          <w:sz w:val="20"/>
-          <w:szCs w:val="20"/>
-          <w:rtl w:val="0"/>
-          <w:lang w:val="en-US"/>
-        </w:rPr>
-        <w:t>Developed and trained Claude to understand China-specific air-gapped design, embedding LLM functionality within Salesforce platforms and Alibaba Cloud substrates.</w:t>
-      </w:r>
-    </w:p>
-    <w:p>
-      <w:pPr>
-        <w:pStyle w:val="Body"/>
+          <w:rFonts w:ascii="Source Sans Pro" w:cs="Source Sans Pro" w:hAnsi="Source Sans Pro" w:eastAsia="Source Sans Pro"/>
+          <w:sz w:val="20"/>
+          <w:szCs w:val="20"/>
+          <w:rtl w:val="0"/>
+        </w:rPr>
+      </w:pPr>
+      <w:r>
+        <w:rPr>
+          <w:rFonts w:ascii="Source Sans Pro" w:cs="Source Sans Pro" w:hAnsi="Source Sans Pro" w:eastAsia="Source Sans Pro"/>
+          <w:sz w:val="20"/>
+          <w:szCs w:val="20"/>
+          <w:rtl w:val="0"/>
+          <w:lang w:val="en-US"/>
+        </w:rPr>
+        <w:tab/>
+        <w:t>Translated ambiguous regulatory and platform requirements into scalable technical architecture, delivery plans, and production-ready implementations.</w:t>
+      </w:r>
+    </w:p>
+    <w:p>
+      <w:pPr>
+        <w:pStyle w:val="Body A"/>
         <w:numPr>
           <w:ilvl w:val="0"/>
           <w:numId w:val="4"/>
@@ -875,26 +919,27 @@
         <w:ind w:right="0"/>
         <w:jc w:val="left"/>
         <w:rPr>
-          <w:sz w:val="20"/>
-          <w:szCs w:val="20"/>
-          <w:rtl w:val="0"/>
-          <w:lang w:val="en-US"/>
-        </w:rPr>
-      </w:pPr>
-      <w:r>
-        <w:rPr>
-          <w:rStyle w:val="None"/>
-          <w:sz w:val="20"/>
-          <w:szCs w:val="20"/>
-          <w:rtl w:val="0"/>
-          <w:lang w:val="en-US"/>
-        </w:rPr>
-        <w:t>Successfully migrated 75% of Mulesoft services to Hyperforce (Salesforce Infrastructure built on AWS) within a year.</w:t>
-      </w:r>
-    </w:p>
-    <w:p>
-      <w:pPr>
-        <w:pStyle w:val="Body"/>
+          <w:rFonts w:ascii="Source Sans Pro" w:cs="Source Sans Pro" w:hAnsi="Source Sans Pro" w:eastAsia="Source Sans Pro"/>
+          <w:sz w:val="20"/>
+          <w:szCs w:val="20"/>
+          <w:rtl w:val="0"/>
+        </w:rPr>
+      </w:pPr>
+      <w:r>
+        <w:rPr>
+          <w:rFonts w:ascii="Source Sans Pro" w:cs="Source Sans Pro" w:hAnsi="Source Sans Pro" w:eastAsia="Source Sans Pro"/>
+          <w:sz w:val="20"/>
+          <w:szCs w:val="20"/>
+          <w:rtl w:val="0"/>
+          <w:lang w:val="en-US"/>
+        </w:rPr>
+        <w:tab/>
+        <w:t>Trained Claude-based workflows to accelerate design iteration, system-context creation, and implementation planning for constrained enterprise environments.</w:t>
+      </w:r>
+    </w:p>
+    <w:p>
+      <w:pPr>
+        <w:pStyle w:val="Body A"/>
         <w:numPr>
           <w:ilvl w:val="0"/>
           <w:numId w:val="4"/>
@@ -903,26 +948,60 @@
         <w:ind w:right="0"/>
         <w:jc w:val="left"/>
         <w:rPr>
-          <w:sz w:val="20"/>
-          <w:szCs w:val="20"/>
-          <w:rtl w:val="0"/>
-          <w:lang w:val="en-US"/>
-        </w:rPr>
-      </w:pPr>
-      <w:r>
-        <w:rPr>
-          <w:rStyle w:val="None"/>
-          <w:sz w:val="20"/>
-          <w:szCs w:val="20"/>
-          <w:rtl w:val="0"/>
-          <w:lang w:val="en-US"/>
-        </w:rPr>
-        <w:t>Defined technical roadmaps for public cloud-native architecture in collaboration with Alibaba Cloud services.</w:t>
-      </w:r>
-    </w:p>
-    <w:p>
-      <w:pPr>
-        <w:pStyle w:val="Body"/>
+          <w:rFonts w:ascii="Source Sans Pro" w:cs="Source Sans Pro" w:hAnsi="Source Sans Pro" w:eastAsia="Source Sans Pro"/>
+          <w:sz w:val="20"/>
+          <w:szCs w:val="20"/>
+          <w:rtl w:val="0"/>
+          <w:lang w:val="en-US"/>
+        </w:rPr>
+      </w:pPr>
+      <w:r>
+        <w:rPr>
+          <w:rFonts w:ascii="Source Sans Pro" w:cs="Source Sans Pro" w:hAnsi="Source Sans Pro" w:eastAsia="Source Sans Pro"/>
+          <w:sz w:val="20"/>
+          <w:szCs w:val="20"/>
+          <w:rtl w:val="0"/>
+          <w:lang w:val="en-US"/>
+        </w:rPr>
+        <w:t>E</w:t>
+      </w:r>
+      <w:r>
+        <w:rPr>
+          <w:rStyle w:val="None"/>
+          <w:rFonts w:ascii="Source Sans Pro" w:cs="Source Sans Pro" w:hAnsi="Source Sans Pro" w:eastAsia="Source Sans Pro"/>
+          <w:sz w:val="20"/>
+          <w:szCs w:val="20"/>
+          <w:rtl w:val="0"/>
+          <w:lang w:val="en-US"/>
+        </w:rPr>
+        <w:t>mbedd</w:t>
+      </w:r>
+      <w:r>
+        <w:rPr>
+          <w:rStyle w:val="None"/>
+          <w:rFonts w:ascii="Source Sans Pro" w:cs="Source Sans Pro" w:hAnsi="Source Sans Pro" w:eastAsia="Source Sans Pro"/>
+          <w:sz w:val="20"/>
+          <w:szCs w:val="20"/>
+          <w:rtl w:val="0"/>
+          <w:lang w:val="en-US"/>
+        </w:rPr>
+        <w:t>ed</w:t>
+      </w:r>
+      <w:r>
+        <w:rPr>
+          <w:rStyle w:val="None"/>
+          <w:rFonts w:ascii="Source Sans Pro" w:cs="Source Sans Pro" w:hAnsi="Source Sans Pro" w:eastAsia="Source Sans Pro"/>
+          <w:sz w:val="20"/>
+          <w:szCs w:val="20"/>
+          <w:rtl w:val="0"/>
+          <w:lang w:val="en-US"/>
+        </w:rPr>
+        <w:t xml:space="preserve"> LLM functionality within Salesforce platforms and Alibaba Cloud substrates.</w:t>
+      </w:r>
+    </w:p>
+    <w:p>
+      <w:pPr>
+        <w:pStyle w:val="Body A"/>
         <w:numPr>
           <w:ilvl w:val="0"/>
           <w:numId w:val="4"/>
@@ -931,26 +1010,28 @@
         <w:ind w:right="0"/>
         <w:jc w:val="left"/>
         <w:rPr>
-          <w:sz w:val="20"/>
-          <w:szCs w:val="20"/>
-          <w:rtl w:val="0"/>
-          <w:lang w:val="en-US"/>
-        </w:rPr>
-      </w:pPr>
-      <w:r>
-        <w:rPr>
-          <w:rStyle w:val="None"/>
-          <w:sz w:val="20"/>
-          <w:szCs w:val="20"/>
-          <w:rtl w:val="0"/>
-          <w:lang w:val="en-US"/>
-        </w:rPr>
-        <w:t>Wrote 25+ Terraform modules and 20 scripts to deploy services to Alibaba Cloud</w:t>
-      </w:r>
-    </w:p>
-    <w:p>
-      <w:pPr>
-        <w:pStyle w:val="Body"/>
+          <w:rFonts w:ascii="Source Sans Pro" w:cs="Source Sans Pro" w:hAnsi="Source Sans Pro" w:eastAsia="Source Sans Pro"/>
+          <w:sz w:val="20"/>
+          <w:szCs w:val="20"/>
+          <w:rtl w:val="0"/>
+          <w:lang w:val="en-US"/>
+        </w:rPr>
+      </w:pPr>
+      <w:r>
+        <w:rPr>
+          <w:rStyle w:val="None"/>
+          <w:rFonts w:ascii="Source Sans Pro" w:cs="Source Sans Pro" w:hAnsi="Source Sans Pro" w:eastAsia="Source Sans Pro"/>
+          <w:sz w:val="20"/>
+          <w:szCs w:val="20"/>
+          <w:rtl w:val="0"/>
+          <w:lang w:val="en-US"/>
+        </w:rPr>
+        <w:t>Migrated 75% of MuleSoft services to Hyperforce within one year, improving cloud portability and deployment consistency.</w:t>
+      </w:r>
+    </w:p>
+    <w:p>
+      <w:pPr>
+        <w:pStyle w:val="Body A"/>
         <w:numPr>
           <w:ilvl w:val="0"/>
           <w:numId w:val="4"/>
@@ -959,204 +1040,28 @@
         <w:ind w:right="0"/>
         <w:jc w:val="left"/>
         <w:rPr>
-          <w:rFonts w:ascii="Arial" w:hAnsi="Arial"/>
-          <w:outline w:val="0"/>
-          <w:color w:val="000000"/>
-          <w:sz w:val="20"/>
-          <w:szCs w:val="20"/>
-          <w:rtl w:val="0"/>
-          <w:lang w:val="en-US"/>
-          <w14:textFill>
-            <w14:solidFill>
-              <w14:srgbClr w14:val="000000"/>
-            </w14:solidFill>
-          </w14:textFill>
-        </w:rPr>
-      </w:pPr>
-      <w:r>
-        <w:rPr>
-          <w:rStyle w:val="None"/>
-          <w:rFonts w:ascii="Arial" w:hAnsi="Arial"/>
-          <w:outline w:val="0"/>
-          <w:color w:val="080809"/>
-          <w:sz w:val="20"/>
-          <w:szCs w:val="20"/>
-          <w:u w:color="080809"/>
-          <w:shd w:val="clear" w:color="auto" w:fill="ffffff"/>
-          <w:rtl w:val="0"/>
-          <w:lang w:val="en-US"/>
-          <w14:textFill>
-            <w14:solidFill>
-              <w14:srgbClr w14:val="080809"/>
-            </w14:solidFill>
-          </w14:textFill>
-        </w:rPr>
-        <w:t>Collaborated with legal and cross</w:t>
-      </w:r>
-      <w:r>
-        <w:rPr>
-          <w:rStyle w:val="None"/>
-          <w:rFonts w:ascii="Arial" w:hAnsi="Arial" w:hint="default"/>
-          <w:outline w:val="0"/>
-          <w:color w:val="080809"/>
-          <w:sz w:val="20"/>
-          <w:szCs w:val="20"/>
-          <w:u w:color="080809"/>
-          <w:shd w:val="clear" w:color="auto" w:fill="ffffff"/>
-          <w:rtl w:val="0"/>
-          <w:lang w:val="en-US"/>
-          <w14:textFill>
-            <w14:solidFill>
-              <w14:srgbClr w14:val="080809"/>
-            </w14:solidFill>
-          </w14:textFill>
-        </w:rPr>
-        <w:t>‑</w:t>
-      </w:r>
-      <w:r>
-        <w:rPr>
-          <w:rStyle w:val="None"/>
-          <w:rFonts w:ascii="Arial" w:hAnsi="Arial"/>
-          <w:outline w:val="0"/>
-          <w:color w:val="080809"/>
-          <w:sz w:val="20"/>
-          <w:szCs w:val="20"/>
-          <w:u w:color="080809"/>
-          <w:shd w:val="clear" w:color="auto" w:fill="ffffff"/>
-          <w:rtl w:val="0"/>
-          <w:lang w:val="en-US"/>
-          <w14:textFill>
-            <w14:solidFill>
-              <w14:srgbClr w14:val="080809"/>
-            </w14:solidFill>
-          </w14:textFill>
-        </w:rPr>
-        <w:t>functional stakeholders to establish and formalize Salesforce</w:t>
-      </w:r>
-      <w:r>
-        <w:rPr>
-          <w:rStyle w:val="None"/>
-          <w:rFonts w:ascii="Arial" w:hAnsi="Arial" w:hint="default"/>
-          <w:outline w:val="0"/>
-          <w:color w:val="080809"/>
-          <w:sz w:val="20"/>
-          <w:szCs w:val="20"/>
-          <w:u w:color="080809"/>
-          <w:shd w:val="clear" w:color="auto" w:fill="ffffff"/>
-          <w:rtl w:val="0"/>
-          <w:lang w:val="en-US"/>
-          <w14:textFill>
-            <w14:solidFill>
-              <w14:srgbClr w14:val="080809"/>
-            </w14:solidFill>
-          </w14:textFill>
-        </w:rPr>
-        <w:t>’</w:t>
-      </w:r>
-      <w:r>
-        <w:rPr>
-          <w:rStyle w:val="None"/>
-          <w:rFonts w:ascii="Arial" w:hAnsi="Arial"/>
-          <w:outline w:val="0"/>
-          <w:color w:val="080809"/>
-          <w:sz w:val="20"/>
-          <w:szCs w:val="20"/>
-          <w:u w:color="080809"/>
-          <w:shd w:val="clear" w:color="auto" w:fill="ffffff"/>
-          <w:rtl w:val="0"/>
-          <w:lang w:val="en-US"/>
-          <w14:textFill>
-            <w14:solidFill>
-              <w14:srgbClr w14:val="080809"/>
-            </w14:solidFill>
-          </w14:textFill>
-        </w:rPr>
-        <w:t>s strategic collaboration with Alibaba, ensuring compliance with international regulations and aligning partnership terms with the company</w:t>
-      </w:r>
-      <w:r>
-        <w:rPr>
-          <w:rStyle w:val="None"/>
-          <w:rFonts w:ascii="Arial" w:hAnsi="Arial" w:hint="default"/>
-          <w:outline w:val="0"/>
-          <w:color w:val="080809"/>
-          <w:sz w:val="20"/>
-          <w:szCs w:val="20"/>
-          <w:u w:color="080809"/>
-          <w:shd w:val="clear" w:color="auto" w:fill="ffffff"/>
-          <w:rtl w:val="0"/>
-          <w:lang w:val="en-US"/>
-          <w14:textFill>
-            <w14:solidFill>
-              <w14:srgbClr w14:val="080809"/>
-            </w14:solidFill>
-          </w14:textFill>
-        </w:rPr>
-        <w:t>’</w:t>
-      </w:r>
-      <w:r>
-        <w:rPr>
-          <w:rStyle w:val="None"/>
-          <w:rFonts w:ascii="Arial" w:hAnsi="Arial"/>
-          <w:outline w:val="0"/>
-          <w:color w:val="080809"/>
-          <w:sz w:val="20"/>
-          <w:szCs w:val="20"/>
-          <w:u w:color="080809"/>
-          <w:shd w:val="clear" w:color="auto" w:fill="ffffff"/>
-          <w:rtl w:val="0"/>
-          <w:lang w:val="en-US"/>
-          <w14:textFill>
-            <w14:solidFill>
-              <w14:srgbClr w14:val="080809"/>
-            </w14:solidFill>
-          </w14:textFill>
-        </w:rPr>
-        <w:t>s long</w:t>
-      </w:r>
-      <w:r>
-        <w:rPr>
-          <w:rStyle w:val="None"/>
-          <w:rFonts w:ascii="Arial" w:hAnsi="Arial" w:hint="default"/>
-          <w:outline w:val="0"/>
-          <w:color w:val="080809"/>
-          <w:sz w:val="20"/>
-          <w:szCs w:val="20"/>
-          <w:u w:color="080809"/>
-          <w:shd w:val="clear" w:color="auto" w:fill="ffffff"/>
-          <w:rtl w:val="0"/>
-          <w:lang w:val="en-US"/>
-          <w14:textFill>
-            <w14:solidFill>
-              <w14:srgbClr w14:val="080809"/>
-            </w14:solidFill>
-          </w14:textFill>
-        </w:rPr>
-        <w:t>‑</w:t>
-      </w:r>
-      <w:r>
-        <w:rPr>
-          <w:rStyle w:val="None"/>
-          <w:rFonts w:ascii="Arial" w:hAnsi="Arial"/>
-          <w:outline w:val="0"/>
-          <w:color w:val="080809"/>
-          <w:sz w:val="20"/>
-          <w:szCs w:val="20"/>
-          <w:u w:color="080809"/>
-          <w:shd w:val="clear" w:color="auto" w:fill="ffffff"/>
-          <w:rtl w:val="0"/>
-          <w:lang w:val="en-US"/>
-          <w14:textFill>
-            <w14:solidFill>
-              <w14:srgbClr w14:val="080809"/>
-            </w14:solidFill>
-          </w14:textFill>
-        </w:rPr>
-        <w:t>term business objectives.</w:t>
-      </w:r>
-    </w:p>
-    <w:p>
-      <w:pPr>
-        <w:pStyle w:val="Body"/>
+          <w:rFonts w:ascii="Source Sans Pro" w:cs="Source Sans Pro" w:hAnsi="Source Sans Pro" w:eastAsia="Source Sans Pro"/>
+          <w:sz w:val="20"/>
+          <w:szCs w:val="20"/>
+          <w:rtl w:val="0"/>
+          <w:lang w:val="en-US"/>
+        </w:rPr>
+      </w:pPr>
+      <w:r>
+        <w:rPr>
+          <w:rStyle w:val="None"/>
+          <w:rFonts w:ascii="Source Sans Pro" w:cs="Source Sans Pro" w:hAnsi="Source Sans Pro" w:eastAsia="Source Sans Pro"/>
+          <w:sz w:val="20"/>
+          <w:szCs w:val="20"/>
+          <w:rtl w:val="0"/>
+          <w:lang w:val="en-US"/>
+        </w:rPr>
+        <w:t>Implemented Cloud Native Buildpacks to automate container image creation and standardize builds across Salesforce multi-substrate tooling.</w:t>
+      </w:r>
+    </w:p>
+    <w:p>
+      <w:pPr>
+        <w:pStyle w:val="Body A"/>
         <w:numPr>
           <w:ilvl w:val="0"/>
           <w:numId w:val="4"/>
@@ -1165,55 +1070,59 @@
         <w:ind w:right="0"/>
         <w:jc w:val="left"/>
         <w:rPr>
-          <w:rFonts w:ascii="Arial" w:hAnsi="Arial"/>
-          <w:outline w:val="0"/>
-          <w:color w:val="080809"/>
-          <w:sz w:val="20"/>
-          <w:szCs w:val="20"/>
-          <w:rtl w:val="0"/>
-          <w:lang w:val="en-US"/>
-          <w14:textFill>
-            <w14:solidFill>
-              <w14:srgbClr w14:val="080809"/>
-            </w14:solidFill>
-          </w14:textFill>
-        </w:rPr>
-      </w:pPr>
-      <w:r>
-        <w:rPr>
-          <w:rStyle w:val="None"/>
-          <w:rFonts w:ascii="Arial" w:hAnsi="Arial"/>
-          <w:outline w:val="0"/>
-          <w:color w:val="080809"/>
-          <w:sz w:val="20"/>
-          <w:szCs w:val="20"/>
-          <w:u w:color="080809"/>
-          <w:shd w:val="clear" w:color="auto" w:fill="ffffff"/>
-          <w:rtl w:val="0"/>
-          <w:lang w:val="en-US"/>
-          <w14:textFill>
-            <w14:solidFill>
-              <w14:srgbClr w14:val="080809"/>
-            </w14:solidFill>
-          </w14:textFill>
-        </w:rPr>
-        <w:t>Engineered a China Airgap architecture enabling secure, scalable operations and regulatory compliance for internal and customer-facing systems.</w:t>
-      </w:r>
-    </w:p>
-    <w:p>
-      <w:pPr>
-        <w:pStyle w:val="Heading 2"/>
-        <w:rPr>
-          <w:rStyle w:val="None"/>
-          <w:sz w:val="20"/>
-          <w:szCs w:val="20"/>
-        </w:rPr>
-      </w:pPr>
+          <w:rFonts w:ascii="Source Sans Pro" w:cs="Source Sans Pro" w:hAnsi="Source Sans Pro" w:eastAsia="Source Sans Pro"/>
+          <w:sz w:val="20"/>
+          <w:szCs w:val="20"/>
+          <w:rtl w:val="0"/>
+        </w:rPr>
+      </w:pPr>
+      <w:r>
+        <w:rPr>
+          <w:rStyle w:val="None"/>
+          <w:rFonts w:ascii="Source Sans Pro" w:cs="Source Sans Pro" w:hAnsi="Source Sans Pro" w:eastAsia="Source Sans Pro"/>
+          <w:sz w:val="20"/>
+          <w:szCs w:val="20"/>
+          <w:rtl w:val="0"/>
+          <w:lang w:val="en-US"/>
+        </w:rPr>
+        <w:tab/>
+        <w:t>Defined public cloud-native roadmaps with Alibaba Cloud, authored 25+ Terraform modules and 20 automation scripts, and formalized the Salesforce-Alibaba collaboration with legal and cross-functional stakeholders.</w:t>
+      </w:r>
+    </w:p>
+    <w:p>
+      <w:pPr>
+        <w:pStyle w:val="Body A"/>
+        <w:numPr>
+          <w:ilvl w:val="0"/>
+          <w:numId w:val="4"/>
+        </w:numPr>
+        <w:bidi w:val="0"/>
+        <w:ind w:right="0"/>
+        <w:jc w:val="left"/>
+        <w:rPr>
+          <w:rFonts w:ascii="Source Sans Pro" w:cs="Source Sans Pro" w:hAnsi="Source Sans Pro" w:eastAsia="Source Sans Pro"/>
+          <w:sz w:val="20"/>
+          <w:szCs w:val="20"/>
+          <w:rtl w:val="0"/>
+        </w:rPr>
+      </w:pPr>
+      <w:r>
+        <w:rPr>
+          <w:rStyle w:val="None"/>
+          <w:rFonts w:ascii="Source Sans Pro" w:cs="Source Sans Pro" w:hAnsi="Source Sans Pro" w:eastAsia="Source Sans Pro"/>
+          <w:sz w:val="20"/>
+          <w:szCs w:val="20"/>
+          <w:rtl w:val="0"/>
+          <w:lang w:val="en-US"/>
+        </w:rPr>
+        <w:tab/>
+        <w:t>Delivered a secure China air-gap architecture supporting compliant operations for internal and customer-facing systems.</w:t>
+      </w:r>
       <w:bookmarkStart w:name="_headingh.w6wozcgjd2ju" w:id="3"/>
       <w:bookmarkEnd w:id="3"/>
       <w:r>
         <w:rPr>
-          <w:rStyle w:val="None"/>
+          <w:rFonts w:ascii="Source Sans Pro" w:cs="Source Sans Pro" w:hAnsi="Source Sans Pro" w:eastAsia="Source Sans Pro"/>
           <w:sz w:val="20"/>
           <w:szCs w:val="20"/>
           <w:rtl w:val="0"/>
@@ -1223,6 +1132,7 @@
       <w:r>
         <w:rPr>
           <w:rStyle w:val="None"/>
+          <w:rFonts w:ascii="Source Sans Pro" w:cs="Source Sans Pro" w:hAnsi="Source Sans Pro" w:eastAsia="Source Sans Pro"/>
           <w:sz w:val="20"/>
           <w:szCs w:val="20"/>
           <w:rtl w:val="0"/>
@@ -1233,16 +1143,131 @@
     </w:p>
     <w:p>
       <w:pPr>
-        <w:pStyle w:val="Body"/>
-        <w:rPr>
-          <w:rStyle w:val="None"/>
-          <w:sz w:val="20"/>
-          <w:szCs w:val="20"/>
-        </w:rPr>
-      </w:pPr>
-      <w:r>
-        <w:rPr>
-          <w:rStyle w:val="None"/>
+        <w:pStyle w:val="Body A"/>
+        <w:numPr>
+          <w:ilvl w:val="0"/>
+          <w:numId w:val="4"/>
+        </w:numPr>
+        <w:bidi w:val="0"/>
+        <w:ind w:right="0"/>
+        <w:jc w:val="left"/>
+        <w:rPr>
+          <w:rFonts w:ascii="Source Sans Pro" w:cs="Source Sans Pro" w:hAnsi="Source Sans Pro" w:eastAsia="Source Sans Pro"/>
+          <w:sz w:val="20"/>
+          <w:szCs w:val="20"/>
+          <w:rtl w:val="0"/>
+          <w:lang w:val="en-US"/>
+        </w:rPr>
+      </w:pPr>
+      <w:r>
+        <w:rPr>
+          <w:rStyle w:val="None"/>
+          <w:rFonts w:ascii="Source Sans Pro" w:cs="Source Sans Pro" w:hAnsi="Source Sans Pro" w:eastAsia="Source Sans Pro"/>
+          <w:sz w:val="20"/>
+          <w:szCs w:val="20"/>
+          <w:rtl w:val="0"/>
+          <w:lang w:val="en-US"/>
+        </w:rPr>
+        <w:t>Facilitated release planning and stakeholder demos to align roadmap priorities and reduce cross</w:t>
+      </w:r>
+      <w:r>
+        <w:rPr>
+          <w:rStyle w:val="None"/>
+          <w:rFonts w:ascii="Source Sans Pro" w:cs="Source Sans Pro" w:hAnsi="Source Sans Pro" w:eastAsia="Source Sans Pro"/>
+          <w:sz w:val="20"/>
+          <w:szCs w:val="20"/>
+          <w:rtl w:val="0"/>
+          <w:lang w:val="en-US"/>
+        </w:rPr>
+        <w:t>‑</w:t>
+      </w:r>
+      <w:r>
+        <w:rPr>
+          <w:rStyle w:val="None"/>
+          <w:rFonts w:ascii="Source Sans Pro" w:cs="Source Sans Pro" w:hAnsi="Source Sans Pro" w:eastAsia="Source Sans Pro"/>
+          <w:sz w:val="20"/>
+          <w:szCs w:val="20"/>
+          <w:rtl w:val="0"/>
+          <w:lang w:val="en-US"/>
+        </w:rPr>
+        <w:t>team dependencies.</w:t>
+      </w:r>
+    </w:p>
+    <w:p>
+      <w:pPr>
+        <w:pStyle w:val="Body A"/>
+        <w:bidi w:val="0"/>
+        <w:ind w:left="0" w:right="0" w:firstLine="0"/>
+        <w:jc w:val="left"/>
+        <w:rPr>
+          <w:rStyle w:val="None"/>
+          <w:rFonts w:ascii="Source Sans Pro" w:cs="Source Sans Pro" w:hAnsi="Source Sans Pro" w:eastAsia="Source Sans Pro"/>
+          <w:sz w:val="20"/>
+          <w:szCs w:val="20"/>
+          <w:rtl w:val="0"/>
+          <w:lang w:val="en-US"/>
+        </w:rPr>
+      </w:pPr>
+    </w:p>
+    <w:p>
+      <w:pPr>
+        <w:pStyle w:val="Body A"/>
+        <w:bidi w:val="0"/>
+        <w:ind w:left="0" w:right="0" w:firstLine="0"/>
+        <w:jc w:val="left"/>
+        <w:rPr>
+          <w:rStyle w:val="None"/>
+          <w:rFonts w:ascii="Source Sans Pro" w:cs="Source Sans Pro" w:hAnsi="Source Sans Pro" w:eastAsia="Source Sans Pro"/>
+          <w:sz w:val="20"/>
+          <w:szCs w:val="20"/>
+          <w:rtl w:val="0"/>
+          <w:lang w:val="en-US"/>
+        </w:rPr>
+      </w:pPr>
+    </w:p>
+    <w:p>
+      <w:pPr>
+        <w:pStyle w:val="Body A"/>
+        <w:bidi w:val="0"/>
+        <w:ind w:left="0" w:right="0" w:firstLine="0"/>
+        <w:jc w:val="left"/>
+        <w:rPr>
+          <w:rFonts w:ascii="Source Sans Pro" w:cs="Source Sans Pro" w:hAnsi="Source Sans Pro" w:eastAsia="Source Sans Pro"/>
+          <w:b w:val="1"/>
+          <w:bCs w:val="1"/>
+          <w:sz w:val="20"/>
+          <w:szCs w:val="20"/>
+          <w:rtl w:val="0"/>
+        </w:rPr>
+      </w:pPr>
+      <w:r>
+        <w:rPr>
+          <w:rStyle w:val="None"/>
+          <w:rFonts w:ascii="Source Sans Pro" w:cs="Source Sans Pro" w:hAnsi="Source Sans Pro" w:eastAsia="Source Sans Pro"/>
+          <w:b w:val="1"/>
+          <w:bCs w:val="1"/>
+          <w:sz w:val="20"/>
+          <w:szCs w:val="20"/>
+          <w:rtl w:val="0"/>
+          <w:lang w:val="en-US"/>
+        </w:rPr>
+        <w:t>Cloud Architect</w:t>
+      </w:r>
+    </w:p>
+    <w:p>
+      <w:pPr>
+        <w:pStyle w:val="Body A"/>
+        <w:rPr>
+          <w:rStyle w:val="None"/>
+          <w:rFonts w:ascii="Source Sans Pro" w:cs="Source Sans Pro" w:hAnsi="Source Sans Pro" w:eastAsia="Source Sans Pro"/>
+          <w:sz w:val="20"/>
+          <w:szCs w:val="20"/>
+        </w:rPr>
+      </w:pPr>
+      <w:r>
+        <w:rPr>
+          <w:rStyle w:val="None"/>
+          <w:rFonts w:ascii="Source Sans Pro" w:cs="Source Sans Pro" w:hAnsi="Source Sans Pro" w:eastAsia="Source Sans Pro"/>
           <w:sz w:val="20"/>
           <w:szCs w:val="20"/>
           <w:rtl w:val="0"/>
@@ -1257,36 +1282,43 @@
       <w:r>
         <w:rPr>
           <w:rStyle w:val="Hyperlink.1"/>
+          <w:rFonts w:ascii="Source Sans Pro" w:cs="Source Sans Pro" w:hAnsi="Source Sans Pro" w:eastAsia="Source Sans Pro"/>
         </w:rPr>
         <w:fldChar w:fldCharType="begin" w:fldLock="0"/>
       </w:r>
       <w:r>
         <w:rPr>
           <w:rStyle w:val="Hyperlink.1"/>
+          <w:rFonts w:ascii="Source Sans Pro" w:cs="Source Sans Pro" w:hAnsi="Source Sans Pro" w:eastAsia="Source Sans Pro"/>
         </w:rPr>
         <w:instrText xml:space="preserve"> HYPERLINK "https://www.google.com/maps/place/San+Mateo/data=!4m2!3m1!19sChIJRVWp72Cej4ARpxvMLfT8jv0"</w:instrText>
       </w:r>
       <w:r>
         <w:rPr>
           <w:rStyle w:val="Hyperlink.1"/>
+          <w:rFonts w:ascii="Source Sans Pro" w:cs="Source Sans Pro" w:hAnsi="Source Sans Pro" w:eastAsia="Source Sans Pro"/>
         </w:rPr>
         <w:fldChar w:fldCharType="separate" w:fldLock="0"/>
       </w:r>
       <w:r>
         <w:rPr>
           <w:rStyle w:val="Hyperlink.1"/>
+          <w:rFonts w:ascii="Source Sans Pro" w:cs="Source Sans Pro" w:hAnsi="Source Sans Pro" w:eastAsia="Source Sans Pro"/>
           <w:rtl w:val="0"/>
           <w:lang w:val="it-IT"/>
         </w:rPr>
         <w:t>San Mateo</w:t>
       </w:r>
       <w:r>
-        <w:rPr/>
+        <w:rPr>
+          <w:rFonts w:ascii="Source Sans Pro" w:cs="Source Sans Pro" w:hAnsi="Source Sans Pro" w:eastAsia="Source Sans Pro"/>
+        </w:rPr>
         <w:fldChar w:fldCharType="end" w:fldLock="0"/>
       </w:r>
       <w:r>
         <w:rPr>
           <w:rStyle w:val="None"/>
+          <w:rFonts w:ascii="Source Sans Pro" w:cs="Source Sans Pro" w:hAnsi="Source Sans Pro" w:eastAsia="Source Sans Pro"/>
           <w:sz w:val="20"/>
           <w:szCs w:val="20"/>
           <w:rtl w:val="0"/>
@@ -1299,7 +1331,7 @@
     </w:p>
     <w:p>
       <w:pPr>
-        <w:pStyle w:val="Body"/>
+        <w:pStyle w:val="Body A"/>
         <w:widowControl w:val="0"/>
         <w:numPr>
           <w:ilvl w:val="0"/>
@@ -1310,7 +1342,7 @@
         <w:ind w:right="0"/>
         <w:jc w:val="left"/>
         <w:rPr>
-          <w:rFonts w:ascii="Arial" w:hAnsi="Arial"/>
+          <w:rFonts w:ascii="Source Sans Pro" w:cs="Source Sans Pro" w:hAnsi="Source Sans Pro" w:eastAsia="Source Sans Pro"/>
           <w:outline w:val="0"/>
           <w:color w:val="000000"/>
           <w:sz w:val="20"/>
@@ -1327,18 +1359,12 @@
       <w:r>
         <w:rPr>
           <w:rStyle w:val="None"/>
-          <w:rFonts w:ascii="Inter" w:cs="Inter" w:hAnsi="Inter" w:eastAsia="Inter"/>
-          <w:caps w:val="0"/>
-          <w:smallCaps w:val="0"/>
-          <w:strike w:val="0"/>
-          <w:dstrike w:val="0"/>
+          <w:rFonts w:ascii="Source Sans Pro" w:cs="Source Sans Pro" w:hAnsi="Source Sans Pro" w:eastAsia="Source Sans Pro"/>
           <w:outline w:val="0"/>
           <w:color w:val="18191b"/>
           <w:sz w:val="20"/>
           <w:szCs w:val="20"/>
-          <w:u w:val="none" w:color="18191b"/>
-          <w:shd w:val="nil" w:color="auto" w:fill="auto"/>
-          <w:vertAlign w:val="baseline"/>
+          <w:u w:color="18191b"/>
           <w:rtl w:val="0"/>
           <w:lang w:val="en-US"/>
           <w14:textFill>
@@ -1352,7 +1378,7 @@
     </w:p>
     <w:p>
       <w:pPr>
-        <w:pStyle w:val="Body"/>
+        <w:pStyle w:val="Body A"/>
         <w:widowControl w:val="0"/>
         <w:numPr>
           <w:ilvl w:val="0"/>
@@ -1362,7 +1388,7 @@
         <w:ind w:right="0"/>
         <w:jc w:val="left"/>
         <w:rPr>
-          <w:rFonts w:ascii="Arial" w:hAnsi="Arial"/>
+          <w:rFonts w:ascii="Source Sans Pro" w:cs="Source Sans Pro" w:hAnsi="Source Sans Pro" w:eastAsia="Source Sans Pro"/>
           <w:outline w:val="0"/>
           <w:color w:val="000000"/>
           <w:sz w:val="20"/>
@@ -1379,18 +1405,12 @@
       <w:r>
         <w:rPr>
           <w:rStyle w:val="None"/>
-          <w:rFonts w:ascii="Inter" w:cs="Inter" w:hAnsi="Inter" w:eastAsia="Inter"/>
-          <w:caps w:val="0"/>
-          <w:smallCaps w:val="0"/>
-          <w:strike w:val="0"/>
-          <w:dstrike w:val="0"/>
+          <w:rFonts w:ascii="Source Sans Pro" w:cs="Source Sans Pro" w:hAnsi="Source Sans Pro" w:eastAsia="Source Sans Pro"/>
           <w:outline w:val="0"/>
           <w:color w:val="18191b"/>
           <w:sz w:val="20"/>
           <w:szCs w:val="20"/>
-          <w:u w:val="none" w:color="18191b"/>
-          <w:shd w:val="nil" w:color="auto" w:fill="auto"/>
-          <w:vertAlign w:val="baseline"/>
+          <w:u w:color="18191b"/>
           <w:rtl w:val="0"/>
           <w:lang w:val="en-US"/>
           <w14:textFill>
@@ -1404,20 +1424,14 @@
       <w:r>
         <w:rPr>
           <w:rStyle w:val="None"/>
-          <w:rFonts w:ascii="Arial" w:hAnsi="Arial"/>
+          <w:rFonts w:ascii="Source Sans Pro" w:cs="Source Sans Pro" w:hAnsi="Source Sans Pro" w:eastAsia="Source Sans Pro"/>
           <w:b w:val="1"/>
           <w:bCs w:val="1"/>
-          <w:caps w:val="0"/>
-          <w:smallCaps w:val="0"/>
-          <w:strike w:val="0"/>
-          <w:dstrike w:val="0"/>
           <w:outline w:val="0"/>
           <w:color w:val="000000"/>
           <w:sz w:val="20"/>
           <w:szCs w:val="20"/>
-          <w:u w:val="none" w:color="000000"/>
-          <w:shd w:val="nil" w:color="auto" w:fill="auto"/>
-          <w:vertAlign w:val="baseline"/>
+          <w:u w:color="000000"/>
           <w:rtl w:val="0"/>
           <w:lang w:val="en-US"/>
           <w14:textFill>
@@ -1431,18 +1445,12 @@
       <w:r>
         <w:rPr>
           <w:rStyle w:val="None"/>
-          <w:rFonts w:ascii="Arial" w:hAnsi="Arial"/>
-          <w:caps w:val="0"/>
-          <w:smallCaps w:val="0"/>
-          <w:strike w:val="0"/>
-          <w:dstrike w:val="0"/>
+          <w:rFonts w:ascii="Source Sans Pro" w:cs="Source Sans Pro" w:hAnsi="Source Sans Pro" w:eastAsia="Source Sans Pro"/>
           <w:outline w:val="0"/>
           <w:color w:val="000000"/>
           <w:sz w:val="20"/>
           <w:szCs w:val="20"/>
-          <w:u w:val="none" w:color="000000"/>
-          <w:shd w:val="nil" w:color="auto" w:fill="auto"/>
-          <w:vertAlign w:val="baseline"/>
+          <w:u w:color="000000"/>
           <w:rtl w:val="0"/>
           <w:lang w:val="en-US"/>
           <w14:textFill>
@@ -1456,7 +1464,7 @@
     </w:p>
     <w:p>
       <w:pPr>
-        <w:pStyle w:val="Body"/>
+        <w:pStyle w:val="Body A"/>
         <w:widowControl w:val="0"/>
         <w:numPr>
           <w:ilvl w:val="0"/>
@@ -1466,7 +1474,7 @@
         <w:ind w:right="0"/>
         <w:jc w:val="left"/>
         <w:rPr>
-          <w:rFonts w:ascii="Arial" w:hAnsi="Arial"/>
+          <w:rFonts w:ascii="Source Sans Pro" w:cs="Source Sans Pro" w:hAnsi="Source Sans Pro" w:eastAsia="Source Sans Pro"/>
           <w:outline w:val="0"/>
           <w:color w:val="000000"/>
           <w:sz w:val="20"/>
@@ -1483,7 +1491,7 @@
       <w:r>
         <w:rPr>
           <w:rStyle w:val="None"/>
-          <w:rFonts w:ascii="Arial" w:hAnsi="Arial"/>
+          <w:rFonts w:ascii="Source Sans Pro" w:cs="Source Sans Pro" w:hAnsi="Source Sans Pro" w:eastAsia="Source Sans Pro"/>
           <w:outline w:val="0"/>
           <w:color w:val="080809"/>
           <w:sz w:val="20"/>
@@ -1503,7 +1511,7 @@
     </w:p>
     <w:p>
       <w:pPr>
-        <w:pStyle w:val="Body"/>
+        <w:pStyle w:val="Body A"/>
         <w:widowControl w:val="0"/>
         <w:numPr>
           <w:ilvl w:val="0"/>
@@ -1514,7 +1522,7 @@
         <w:ind w:right="0"/>
         <w:jc w:val="left"/>
         <w:rPr>
-          <w:rFonts w:ascii="Arial" w:hAnsi="Arial"/>
+          <w:rFonts w:ascii="Source Sans Pro" w:cs="Source Sans Pro" w:hAnsi="Source Sans Pro" w:eastAsia="Source Sans Pro"/>
           <w:outline w:val="0"/>
           <w:color w:val="000000"/>
           <w:sz w:val="20"/>
@@ -1531,18 +1539,12 @@
       <w:r>
         <w:rPr>
           <w:rStyle w:val="None"/>
-          <w:rFonts w:ascii="Arial" w:hAnsi="Arial"/>
-          <w:caps w:val="0"/>
-          <w:smallCaps w:val="0"/>
-          <w:strike w:val="0"/>
-          <w:dstrike w:val="0"/>
+          <w:rFonts w:ascii="Source Sans Pro" w:cs="Source Sans Pro" w:hAnsi="Source Sans Pro" w:eastAsia="Source Sans Pro"/>
           <w:outline w:val="0"/>
           <w:color w:val="000000"/>
           <w:sz w:val="20"/>
           <w:szCs w:val="20"/>
-          <w:u w:val="none" w:color="000000"/>
-          <w:shd w:val="nil" w:color="auto" w:fill="auto"/>
-          <w:vertAlign w:val="baseline"/>
+          <w:u w:color="000000"/>
           <w:rtl w:val="0"/>
           <w:lang w:val="en-US"/>
           <w14:textFill>
@@ -1559,6 +1561,7 @@
         <w:pStyle w:val="Heading 2"/>
         <w:rPr>
           <w:rStyle w:val="None"/>
+          <w:rFonts w:ascii="Source Sans Pro" w:cs="Source Sans Pro" w:hAnsi="Source Sans Pro" w:eastAsia="Source Sans Pro"/>
           <w:sz w:val="20"/>
           <w:szCs w:val="20"/>
         </w:rPr>
@@ -1568,6 +1571,7 @@
       <w:r>
         <w:rPr>
           <w:rStyle w:val="None"/>
+          <w:rFonts w:ascii="Source Sans Pro" w:cs="Source Sans Pro" w:hAnsi="Source Sans Pro" w:eastAsia="Source Sans Pro"/>
           <w:sz w:val="20"/>
           <w:szCs w:val="20"/>
           <w:rtl w:val="0"/>
@@ -1577,6 +1581,7 @@
       <w:r>
         <w:rPr>
           <w:rStyle w:val="None"/>
+          <w:rFonts w:ascii="Source Sans Pro" w:cs="Source Sans Pro" w:hAnsi="Source Sans Pro" w:eastAsia="Source Sans Pro"/>
           <w:sz w:val="20"/>
           <w:szCs w:val="20"/>
           <w:rtl w:val="0"/>
@@ -1587,16 +1592,18 @@
     </w:p>
     <w:p>
       <w:pPr>
-        <w:pStyle w:val="Body"/>
-        <w:rPr>
-          <w:rStyle w:val="None"/>
-          <w:sz w:val="20"/>
-          <w:szCs w:val="20"/>
-        </w:rPr>
-      </w:pPr>
-      <w:r>
-        <w:rPr>
-          <w:rStyle w:val="None"/>
+        <w:pStyle w:val="Body A"/>
+        <w:rPr>
+          <w:rStyle w:val="None"/>
+          <w:rFonts w:ascii="Source Sans Pro" w:cs="Source Sans Pro" w:hAnsi="Source Sans Pro" w:eastAsia="Source Sans Pro"/>
+          <w:sz w:val="20"/>
+          <w:szCs w:val="20"/>
+        </w:rPr>
+      </w:pPr>
+      <w:r>
+        <w:rPr>
+          <w:rStyle w:val="None"/>
+          <w:rFonts w:ascii="Source Sans Pro" w:cs="Source Sans Pro" w:hAnsi="Source Sans Pro" w:eastAsia="Source Sans Pro"/>
           <w:sz w:val="20"/>
           <w:szCs w:val="20"/>
           <w:rtl w:val="0"/>
@@ -1617,7 +1624,7 @@
     </w:p>
     <w:p>
       <w:pPr>
-        <w:pStyle w:val="Body"/>
+        <w:pStyle w:val="Body A"/>
         <w:widowControl w:val="0"/>
         <w:numPr>
           <w:ilvl w:val="0"/>
@@ -1628,7 +1635,7 @@
         <w:ind w:right="0"/>
         <w:jc w:val="left"/>
         <w:rPr>
-          <w:rFonts w:ascii="Arial" w:hAnsi="Arial"/>
+          <w:rFonts w:ascii="Source Sans Pro" w:cs="Source Sans Pro" w:hAnsi="Source Sans Pro" w:eastAsia="Source Sans Pro"/>
           <w:outline w:val="0"/>
           <w:color w:val="000000"/>
           <w:sz w:val="20"/>
@@ -1645,18 +1652,11 @@
       <w:r>
         <w:rPr>
           <w:rStyle w:val="None"/>
-          <w:rFonts w:ascii="Inter" w:cs="Inter" w:hAnsi="Inter" w:eastAsia="Inter"/>
-          <w:caps w:val="0"/>
-          <w:smallCaps w:val="0"/>
-          <w:strike w:val="0"/>
-          <w:dstrike w:val="0"/>
+          <w:rFonts w:ascii="Source Sans Pro" w:cs="Source Sans Pro" w:hAnsi="Source Sans Pro" w:eastAsia="Source Sans Pro"/>
           <w:outline w:val="0"/>
           <w:color w:val="1f1f1f"/>
           <w:sz w:val="20"/>
           <w:szCs w:val="20"/>
-          <w:u w:val="none" w:color="1f1f1f"/>
-          <w:shd w:val="nil" w:color="auto" w:fill="auto"/>
-          <w:vertAlign w:val="baseline"/>
           <w:rtl w:val="0"/>
           <w:lang w:val="en-US"/>
           <w14:textFill>
@@ -1670,7 +1670,7 @@
     </w:p>
     <w:p>
       <w:pPr>
-        <w:pStyle w:val="Body"/>
+        <w:pStyle w:val="Body A"/>
         <w:widowControl w:val="0"/>
         <w:numPr>
           <w:ilvl w:val="0"/>
@@ -1680,7 +1680,7 @@
         <w:ind w:right="0"/>
         <w:jc w:val="left"/>
         <w:rPr>
-          <w:rFonts w:ascii="Arial" w:hAnsi="Arial"/>
+          <w:rFonts w:ascii="Source Sans Pro" w:cs="Source Sans Pro" w:hAnsi="Source Sans Pro" w:eastAsia="Source Sans Pro"/>
           <w:outline w:val="0"/>
           <w:color w:val="000000"/>
           <w:sz w:val="20"/>
@@ -1697,18 +1697,11 @@
       <w:r>
         <w:rPr>
           <w:rStyle w:val="None"/>
-          <w:rFonts w:ascii="Inter" w:cs="Inter" w:hAnsi="Inter" w:eastAsia="Inter"/>
-          <w:caps w:val="0"/>
-          <w:smallCaps w:val="0"/>
-          <w:strike w:val="0"/>
-          <w:dstrike w:val="0"/>
+          <w:rFonts w:ascii="Source Sans Pro" w:cs="Source Sans Pro" w:hAnsi="Source Sans Pro" w:eastAsia="Source Sans Pro"/>
           <w:outline w:val="0"/>
           <w:color w:val="1f1f1f"/>
           <w:sz w:val="20"/>
           <w:szCs w:val="20"/>
-          <w:u w:val="none" w:color="1f1f1f"/>
-          <w:shd w:val="nil" w:color="auto" w:fill="auto"/>
-          <w:vertAlign w:val="baseline"/>
           <w:rtl w:val="0"/>
           <w:lang w:val="en-US"/>
           <w14:textFill>
@@ -1717,29 +1710,65 @@
             </w14:solidFill>
           </w14:textFill>
         </w:rPr>
-        <w:t>Managed, scaled, and ensured high availability (99.99%) for mission-critical production infrastructure across on-prem and private cloud environments using Chef</w:t>
-      </w:r>
-      <w:r>
-        <w:rPr>
-          <w:rStyle w:val="None"/>
-          <w:rFonts w:ascii="Inter" w:cs="Inter" w:hAnsi="Inter" w:eastAsia="Inter"/>
+        <w:t>Managed, scaled, and ensured high availability (99.99%) for mission-critical production infrastructure across on</w:t>
+      </w:r>
+      <w:r>
+        <w:rPr>
+          <w:rStyle w:val="None"/>
+          <w:rFonts w:ascii="Source Sans Pro" w:cs="Source Sans Pro" w:hAnsi="Source Sans Pro" w:eastAsia="Source Sans Pro"/>
           <w:outline w:val="0"/>
           <w:color w:val="1f1f1f"/>
           <w:sz w:val="20"/>
           <w:szCs w:val="20"/>
           <w:rtl w:val="0"/>
+          <w:lang w:val="en-US"/>
           <w14:textFill>
             <w14:solidFill>
               <w14:srgbClr w14:val="1F1F1F"/>
             </w14:solidFill>
           </w14:textFill>
         </w:rPr>
+        <w:t xml:space="preserve"> premise</w:t>
+      </w:r>
+      <w:r>
+        <w:rPr>
+          <w:rStyle w:val="None"/>
+          <w:rFonts w:ascii="Source Sans Pro" w:cs="Source Sans Pro" w:hAnsi="Source Sans Pro" w:eastAsia="Source Sans Pro"/>
+          <w:outline w:val="0"/>
+          <w:color w:val="1f1f1f"/>
+          <w:sz w:val="20"/>
+          <w:szCs w:val="20"/>
+          <w:rtl w:val="0"/>
+          <w:lang w:val="en-US"/>
+          <w14:textFill>
+            <w14:solidFill>
+              <w14:srgbClr w14:val="1F1F1F"/>
+            </w14:solidFill>
+          </w14:textFill>
+        </w:rPr>
+        <w:t xml:space="preserve"> and private cloud environments using Chef</w:t>
+      </w:r>
+      <w:r>
+        <w:rPr>
+          <w:rStyle w:val="None"/>
+          <w:rFonts w:ascii="Source Sans Pro" w:cs="Source Sans Pro" w:hAnsi="Source Sans Pro" w:eastAsia="Source Sans Pro"/>
+          <w:outline w:val="0"/>
+          <w:color w:val="1f1f1f"/>
+          <w:sz w:val="20"/>
+          <w:szCs w:val="20"/>
+          <w:rtl w:val="0"/>
+          <w14:textFill>
+            <w14:solidFill>
+              <w14:srgbClr w14:val="1F1F1F"/>
+            </w14:solidFill>
+          </w14:textFill>
+        </w:rPr>
         <w:t>.</w:t>
       </w:r>
     </w:p>
     <w:p>
       <w:pPr>
-        <w:pStyle w:val="Body"/>
+        <w:pStyle w:val="Body A"/>
         <w:widowControl w:val="0"/>
         <w:numPr>
           <w:ilvl w:val="0"/>
@@ -1750,7 +1779,7 @@
         <w:ind w:right="0"/>
         <w:jc w:val="left"/>
         <w:rPr>
-          <w:rFonts w:ascii="Arial" w:hAnsi="Arial"/>
+          <w:rFonts w:ascii="Source Sans Pro" w:cs="Source Sans Pro" w:hAnsi="Source Sans Pro" w:eastAsia="Source Sans Pro"/>
           <w:outline w:val="0"/>
           <w:color w:val="000000"/>
           <w:sz w:val="20"/>
@@ -1766,7 +1795,7 @@
       <w:r>
         <w:rPr>
           <w:rStyle w:val="None"/>
-          <w:rFonts w:ascii="Inter" w:cs="Inter" w:hAnsi="Inter" w:eastAsia="Inter"/>
+          <w:rFonts w:ascii="Source Sans Pro" w:cs="Source Sans Pro" w:hAnsi="Source Sans Pro" w:eastAsia="Source Sans Pro"/>
           <w:outline w:val="0"/>
           <w:color w:val="1f1f1f"/>
           <w:sz w:val="20"/>
@@ -1783,18 +1812,11 @@
       <w:r>
         <w:rPr>
           <w:rStyle w:val="None"/>
-          <w:rFonts w:ascii="Inter" w:cs="Inter" w:hAnsi="Inter" w:eastAsia="Inter"/>
-          <w:caps w:val="0"/>
-          <w:smallCaps w:val="0"/>
-          <w:strike w:val="0"/>
-          <w:dstrike w:val="0"/>
+          <w:rFonts w:ascii="Source Sans Pro" w:cs="Source Sans Pro" w:hAnsi="Source Sans Pro" w:eastAsia="Source Sans Pro"/>
           <w:outline w:val="0"/>
           <w:color w:val="1f1f1f"/>
           <w:sz w:val="20"/>
           <w:szCs w:val="20"/>
-          <w:u w:val="none" w:color="1f1f1f"/>
-          <w:shd w:val="nil" w:color="auto" w:fill="auto"/>
-          <w:vertAlign w:val="baseline"/>
           <w:rtl w:val="0"/>
           <w:lang w:val="en-US"/>
           <w14:textFill>
@@ -1808,7 +1830,7 @@
       <w:r>
         <w:rPr>
           <w:rStyle w:val="None"/>
-          <w:rFonts w:ascii="Inter" w:cs="Inter" w:hAnsi="Inter" w:eastAsia="Inter"/>
+          <w:rFonts w:ascii="Source Sans Pro" w:cs="Source Sans Pro" w:hAnsi="Source Sans Pro" w:eastAsia="Source Sans Pro"/>
           <w:outline w:val="0"/>
           <w:color w:val="1f1f1f"/>
           <w:sz w:val="20"/>
@@ -1825,18 +1847,11 @@
       <w:r>
         <w:rPr>
           <w:rStyle w:val="None"/>
-          <w:rFonts w:ascii="Inter" w:cs="Inter" w:hAnsi="Inter" w:eastAsia="Inter"/>
-          <w:caps w:val="0"/>
-          <w:smallCaps w:val="0"/>
-          <w:strike w:val="0"/>
-          <w:dstrike w:val="0"/>
+          <w:rFonts w:ascii="Source Sans Pro" w:cs="Source Sans Pro" w:hAnsi="Source Sans Pro" w:eastAsia="Source Sans Pro"/>
           <w:outline w:val="0"/>
           <w:color w:val="1f1f1f"/>
           <w:sz w:val="20"/>
           <w:szCs w:val="20"/>
-          <w:u w:val="none" w:color="1f1f1f"/>
-          <w:shd w:val="nil" w:color="auto" w:fill="auto"/>
-          <w:vertAlign w:val="baseline"/>
           <w:rtl w:val="0"/>
           <w:lang w:val="en-US"/>
           <w14:textFill>
@@ -1850,12 +1865,11 @@
     </w:p>
     <w:p>
       <w:pPr>
-        <w:pStyle w:val="Body"/>
+        <w:pStyle w:val="Body A"/>
         <w:widowControl w:val="0"/>
         <w:spacing w:after="240"/>
         <w:rPr>
-          <w:rStyle w:val="None"/>
-          <w:rFonts w:ascii="Arial" w:cs="Arial" w:hAnsi="Arial" w:eastAsia="Arial"/>
+          <w:rFonts w:ascii="Source Sans Pro" w:cs="Source Sans Pro" w:hAnsi="Source Sans Pro" w:eastAsia="Source Sans Pro"/>
           <w:outline w:val="0"/>
           <w:color w:val="000000"/>
           <w:sz w:val="20"/>
@@ -1871,14 +1885,11 @@
     </w:p>
     <w:p>
       <w:pPr>
-        <w:pStyle w:val="Body"/>
+        <w:pStyle w:val="Body A"/>
         <w:widowControl w:val="0"/>
         <w:spacing w:after="240"/>
         <w:rPr>
-          <w:rStyle w:val="None"/>
-          <w:rFonts w:ascii="Arial" w:cs="Arial" w:hAnsi="Arial" w:eastAsia="Arial"/>
-          <w:b w:val="1"/>
-          <w:bCs w:val="1"/>
+          <w:rFonts w:ascii="Source Sans Pro" w:cs="Source Sans Pro" w:hAnsi="Source Sans Pro" w:eastAsia="Source Sans Pro"/>
           <w:outline w:val="0"/>
           <w:color w:val="000000"/>
           <w:sz w:val="20"/>
@@ -1891,10 +1902,15 @@
           </w14:textFill>
         </w:rPr>
       </w:pPr>
-      <w:r>
-        <w:rPr>
-          <w:rStyle w:val="None"/>
-          <w:rFonts w:ascii="Arial" w:hAnsi="Arial"/>
+    </w:p>
+    <w:p>
+      <w:pPr>
+        <w:pStyle w:val="Body A"/>
+        <w:widowControl w:val="0"/>
+        <w:spacing w:after="240"/>
+        <w:rPr>
+          <w:rStyle w:val="None"/>
+          <w:rFonts w:ascii="Source Sans Pro" w:cs="Source Sans Pro" w:hAnsi="Source Sans Pro" w:eastAsia="Source Sans Pro"/>
           <w:b w:val="1"/>
           <w:bCs w:val="1"/>
           <w:outline w:val="0"/>
@@ -1902,22 +1918,41 @@
           <w:sz w:val="20"/>
           <w:szCs w:val="20"/>
           <w:u w:color="000000"/>
-          <w:rtl w:val="0"/>
-          <w:lang w:val="en-US"/>
           <w14:textFill>
             <w14:solidFill>
               <w14:srgbClr w14:val="000000"/>
             </w14:solidFill>
           </w14:textFill>
         </w:rPr>
+      </w:pPr>
+      <w:r>
+        <w:rPr>
+          <w:rStyle w:val="None"/>
+          <w:rFonts w:ascii="Source Sans Pro" w:cs="Source Sans Pro" w:hAnsi="Source Sans Pro" w:eastAsia="Source Sans Pro"/>
+          <w:b w:val="1"/>
+          <w:bCs w:val="1"/>
+          <w:outline w:val="0"/>
+          <w:color w:val="000000"/>
+          <w:sz w:val="20"/>
+          <w:szCs w:val="20"/>
+          <w:u w:color="000000"/>
+          <w:rtl w:val="0"/>
+          <w:lang w:val="en-US"/>
+          <w14:textFill>
+            <w14:solidFill>
+              <w14:srgbClr w14:val="000000"/>
+            </w14:solidFill>
+          </w14:textFill>
+        </w:rPr>
         <w:t>Education</w:t>
       </w:r>
     </w:p>
     <w:p>
       <w:pPr>
-        <w:pStyle w:val="Body"/>
-        <w:rPr>
-          <w:rStyle w:val="None"/>
+        <w:pStyle w:val="Body A"/>
+        <w:rPr>
+          <w:rStyle w:val="None"/>
+          <w:rFonts w:ascii="Source Sans Pro" w:cs="Source Sans Pro" w:hAnsi="Source Sans Pro" w:eastAsia="Source Sans Pro"/>
           <w:sz w:val="18"/>
           <w:szCs w:val="18"/>
         </w:rPr>
@@ -1925,6 +1960,7 @@
       <w:r>
         <w:rPr>
           <w:rStyle w:val="None"/>
+          <w:rFonts w:ascii="Source Sans Pro" w:cs="Source Sans Pro" w:hAnsi="Source Sans Pro" w:eastAsia="Source Sans Pro"/>
           <w:sz w:val="18"/>
           <w:szCs w:val="18"/>
           <w:rtl w:val="0"/>
@@ -1934,6 +1970,7 @@
       <w:r>
         <w:rPr>
           <w:rStyle w:val="None"/>
+          <w:rFonts w:ascii="Source Sans Pro" w:cs="Source Sans Pro" w:hAnsi="Source Sans Pro" w:eastAsia="Source Sans Pro"/>
           <w:sz w:val="18"/>
           <w:szCs w:val="18"/>
           <w:rtl w:val="1"/>
@@ -1943,6 +1980,7 @@
       <w:r>
         <w:rPr>
           <w:rStyle w:val="None"/>
+          <w:rFonts w:ascii="Source Sans Pro" w:cs="Source Sans Pro" w:hAnsi="Source Sans Pro" w:eastAsia="Source Sans Pro"/>
           <w:sz w:val="18"/>
           <w:szCs w:val="18"/>
           <w:rtl w:val="0"/>
@@ -1953,16 +1991,12 @@
     </w:p>
     <w:p>
       <w:pPr>
-        <w:pStyle w:val="Body"/>
-        <w:rPr>
-          <w:rStyle w:val="None"/>
-          <w:sz w:val="18"/>
-          <w:szCs w:val="18"/>
-        </w:rPr>
-      </w:pPr>
-      <w:r>
-        <w:rPr>
-          <w:rStyle w:val="None"/>
+        <w:pStyle w:val="Body A"/>
+      </w:pPr>
+      <w:r>
+        <w:rPr>
+          <w:rStyle w:val="None"/>
+          <w:rFonts w:ascii="Source Sans Pro" w:cs="Source Sans Pro" w:hAnsi="Source Sans Pro" w:eastAsia="Source Sans Pro"/>
           <w:sz w:val="18"/>
           <w:szCs w:val="18"/>
           <w:rtl w:val="0"/>
@@ -1977,36 +2011,43 @@
       <w:r>
         <w:rPr>
           <w:rStyle w:val="Hyperlink.2"/>
+          <w:rFonts w:ascii="Source Sans Pro" w:cs="Source Sans Pro" w:hAnsi="Source Sans Pro" w:eastAsia="Source Sans Pro"/>
         </w:rPr>
         <w:fldChar w:fldCharType="begin" w:fldLock="0"/>
       </w:r>
       <w:r>
         <w:rPr>
           <w:rStyle w:val="Hyperlink.2"/>
+          <w:rFonts w:ascii="Source Sans Pro" w:cs="Source Sans Pro" w:hAnsi="Source Sans Pro" w:eastAsia="Source Sans Pro"/>
         </w:rPr>
         <w:instrText xml:space="preserve"> HYPERLINK "https://www.google.com/maps/place/Santa+Clara/data=!4m2!3m1!19sChIJk8EIXIG3j4ARwL_Ao3ykdeQ"</w:instrText>
       </w:r>
       <w:r>
         <w:rPr>
           <w:rStyle w:val="Hyperlink.2"/>
+          <w:rFonts w:ascii="Source Sans Pro" w:cs="Source Sans Pro" w:hAnsi="Source Sans Pro" w:eastAsia="Source Sans Pro"/>
         </w:rPr>
         <w:fldChar w:fldCharType="separate" w:fldLock="0"/>
       </w:r>
       <w:r>
         <w:rPr>
           <w:rStyle w:val="Hyperlink.2"/>
+          <w:rFonts w:ascii="Source Sans Pro" w:cs="Source Sans Pro" w:hAnsi="Source Sans Pro" w:eastAsia="Source Sans Pro"/>
           <w:rtl w:val="0"/>
           <w:lang w:val="pt-PT"/>
         </w:rPr>
         <w:t>Santa Clara</w:t>
       </w:r>
       <w:r>
-        <w:rPr/>
+        <w:rPr>
+          <w:rFonts w:ascii="Source Sans Pro" w:cs="Source Sans Pro" w:hAnsi="Source Sans Pro" w:eastAsia="Source Sans Pro"/>
+        </w:rPr>
         <w:fldChar w:fldCharType="end" w:fldLock="0"/>
       </w:r>
       <w:r>
         <w:rPr>
           <w:rStyle w:val="None"/>
+          <w:rFonts w:ascii="Source Sans Pro" w:cs="Source Sans Pro" w:hAnsi="Source Sans Pro" w:eastAsia="Source Sans Pro"/>
           <w:sz w:val="18"/>
           <w:szCs w:val="18"/>
           <w:rtl w:val="0"/>
@@ -2016,18 +2057,6 @@
         <w:tab/>
         <w:tab/>
         <w:t>June 2001</w:t>
-      </w:r>
-    </w:p>
-    <w:p>
-      <w:pPr>
-        <w:pStyle w:val="Body"/>
-      </w:pPr>
-      <w:r>
-        <w:rPr>
-          <w:rStyle w:val="None"/>
-          <w:sz w:val="18"/>
-          <w:szCs w:val="18"/>
-        </w:rPr>
       </w:r>
     </w:p>
     <w:sectPr>
@@ -2085,7 +2114,11 @@
         <w:ind w:left="720" w:hanging="360"/>
       </w:pPr>
       <w:rPr>
-        <w:rFonts w:hAnsi="Arial Unicode MS"/>
+        <w:rFonts w:ascii="Arial Unicode MS" w:cs="Arial Unicode MS" w:hAnsi="Arial Unicode MS" w:eastAsia="Arial Unicode MS"/>
+        <w:b w:val="0"/>
+        <w:bCs w:val="0"/>
+        <w:i w:val="0"/>
+        <w:iCs w:val="0"/>
         <w:caps w:val="0"/>
         <w:smallCaps w:val="0"/>
         <w:strike w:val="0"/>
@@ -2111,7 +2144,11 @@
         <w:ind w:left="1440" w:hanging="360"/>
       </w:pPr>
       <w:rPr>
-        <w:rFonts w:hAnsi="Arial Unicode MS"/>
+        <w:rFonts w:ascii="Arial Unicode MS" w:cs="Arial Unicode MS" w:hAnsi="Arial Unicode MS" w:eastAsia="Arial Unicode MS"/>
+        <w:b w:val="0"/>
+        <w:bCs w:val="0"/>
+        <w:i w:val="0"/>
+        <w:iCs w:val="0"/>
         <w:caps w:val="0"/>
         <w:smallCaps w:val="0"/>
         <w:strike w:val="0"/>
@@ -2137,7 +2174,11 @@
         <w:ind w:left="2160" w:hanging="360"/>
       </w:pPr>
       <w:rPr>
-        <w:rFonts w:hAnsi="Arial Unicode MS"/>
+        <w:rFonts w:ascii="Arial Unicode MS" w:cs="Arial Unicode MS" w:hAnsi="Arial Unicode MS" w:eastAsia="Arial Unicode MS"/>
+        <w:b w:val="0"/>
+        <w:bCs w:val="0"/>
+        <w:i w:val="0"/>
+        <w:iCs w:val="0"/>
         <w:caps w:val="0"/>
         <w:smallCaps w:val="0"/>
         <w:strike w:val="0"/>
@@ -2163,7 +2204,11 @@
         <w:ind w:left="2880" w:hanging="360"/>
       </w:pPr>
       <w:rPr>
-        <w:rFonts w:hAnsi="Arial Unicode MS"/>
+        <w:rFonts w:ascii="Arial Unicode MS" w:cs="Arial Unicode MS" w:hAnsi="Arial Unicode MS" w:eastAsia="Arial Unicode MS"/>
+        <w:b w:val="0"/>
+        <w:bCs w:val="0"/>
+        <w:i w:val="0"/>
+        <w:iCs w:val="0"/>
         <w:caps w:val="0"/>
         <w:smallCaps w:val="0"/>
         <w:strike w:val="0"/>
@@ -2189,7 +2234,11 @@
         <w:ind w:left="3600" w:hanging="360"/>
       </w:pPr>
       <w:rPr>
-        <w:rFonts w:hAnsi="Arial Unicode MS"/>
+        <w:rFonts w:ascii="Arial Unicode MS" w:cs="Arial Unicode MS" w:hAnsi="Arial Unicode MS" w:eastAsia="Arial Unicode MS"/>
+        <w:b w:val="0"/>
+        <w:bCs w:val="0"/>
+        <w:i w:val="0"/>
+        <w:iCs w:val="0"/>
         <w:caps w:val="0"/>
         <w:smallCaps w:val="0"/>
         <w:strike w:val="0"/>
@@ -2215,7 +2264,11 @@
         <w:ind w:left="4320" w:hanging="360"/>
       </w:pPr>
       <w:rPr>
-        <w:rFonts w:hAnsi="Arial Unicode MS"/>
+        <w:rFonts w:ascii="Arial Unicode MS" w:cs="Arial Unicode MS" w:hAnsi="Arial Unicode MS" w:eastAsia="Arial Unicode MS"/>
+        <w:b w:val="0"/>
+        <w:bCs w:val="0"/>
+        <w:i w:val="0"/>
+        <w:iCs w:val="0"/>
         <w:caps w:val="0"/>
         <w:smallCaps w:val="0"/>
         <w:strike w:val="0"/>
@@ -2241,7 +2294,11 @@
         <w:ind w:left="5040" w:hanging="360"/>
       </w:pPr>
       <w:rPr>
-        <w:rFonts w:hAnsi="Arial Unicode MS"/>
+        <w:rFonts w:ascii="Arial Unicode MS" w:cs="Arial Unicode MS" w:hAnsi="Arial Unicode MS" w:eastAsia="Arial Unicode MS"/>
+        <w:b w:val="0"/>
+        <w:bCs w:val="0"/>
+        <w:i w:val="0"/>
+        <w:iCs w:val="0"/>
         <w:caps w:val="0"/>
         <w:smallCaps w:val="0"/>
         <w:strike w:val="0"/>
@@ -2267,7 +2324,11 @@
         <w:ind w:left="5760" w:hanging="360"/>
       </w:pPr>
       <w:rPr>
-        <w:rFonts w:hAnsi="Arial Unicode MS"/>
+        <w:rFonts w:ascii="Arial Unicode MS" w:cs="Arial Unicode MS" w:hAnsi="Arial Unicode MS" w:eastAsia="Arial Unicode MS"/>
+        <w:b w:val="0"/>
+        <w:bCs w:val="0"/>
+        <w:i w:val="0"/>
+        <w:iCs w:val="0"/>
         <w:caps w:val="0"/>
         <w:smallCaps w:val="0"/>
         <w:strike w:val="0"/>
@@ -2293,7 +2354,11 @@
         <w:ind w:left="6480" w:hanging="360"/>
       </w:pPr>
       <w:rPr>
-        <w:rFonts w:hAnsi="Arial Unicode MS"/>
+        <w:rFonts w:ascii="Arial Unicode MS" w:cs="Arial Unicode MS" w:hAnsi="Arial Unicode MS" w:eastAsia="Arial Unicode MS"/>
+        <w:b w:val="0"/>
+        <w:bCs w:val="0"/>
+        <w:i w:val="0"/>
+        <w:iCs w:val="0"/>
         <w:caps w:val="0"/>
         <w:smallCaps w:val="0"/>
         <w:strike w:val="0"/>
@@ -2632,7 +2697,11 @@
         <w:ind w:left="720" w:hanging="360"/>
       </w:pPr>
       <w:rPr>
-        <w:rFonts w:hAnsi="Arial Unicode MS"/>
+        <w:rFonts w:ascii="Arial" w:cs="Arial" w:hAnsi="Arial" w:eastAsia="Arial"/>
+        <w:b w:val="0"/>
+        <w:bCs w:val="0"/>
+        <w:i w:val="0"/>
+        <w:iCs w:val="0"/>
         <w:caps w:val="0"/>
         <w:smallCaps w:val="0"/>
         <w:strike w:val="0"/>
@@ -2658,7 +2727,11 @@
         <w:ind w:left="1440" w:hanging="360"/>
       </w:pPr>
       <w:rPr>
-        <w:rFonts w:hAnsi="Arial Unicode MS"/>
+        <w:rFonts w:ascii="Arial" w:cs="Arial" w:hAnsi="Arial" w:eastAsia="Arial"/>
+        <w:b w:val="0"/>
+        <w:bCs w:val="0"/>
+        <w:i w:val="0"/>
+        <w:iCs w:val="0"/>
         <w:caps w:val="0"/>
         <w:smallCaps w:val="0"/>
         <w:strike w:val="0"/>
@@ -2684,7 +2757,11 @@
         <w:ind w:left="2160" w:hanging="360"/>
       </w:pPr>
       <w:rPr>
-        <w:rFonts w:hAnsi="Arial Unicode MS"/>
+        <w:rFonts w:ascii="Arial" w:cs="Arial" w:hAnsi="Arial" w:eastAsia="Arial"/>
+        <w:b w:val="0"/>
+        <w:bCs w:val="0"/>
+        <w:i w:val="0"/>
+        <w:iCs w:val="0"/>
         <w:caps w:val="0"/>
         <w:smallCaps w:val="0"/>
         <w:strike w:val="0"/>
@@ -2710,7 +2787,11 @@
         <w:ind w:left="2880" w:hanging="360"/>
       </w:pPr>
       <w:rPr>
-        <w:rFonts w:hAnsi="Arial Unicode MS"/>
+        <w:rFonts w:ascii="Arial" w:cs="Arial" w:hAnsi="Arial" w:eastAsia="Arial"/>
+        <w:b w:val="0"/>
+        <w:bCs w:val="0"/>
+        <w:i w:val="0"/>
+        <w:iCs w:val="0"/>
         <w:caps w:val="0"/>
         <w:smallCaps w:val="0"/>
         <w:strike w:val="0"/>
@@ -2736,7 +2817,11 @@
         <w:ind w:left="3600" w:hanging="360"/>
       </w:pPr>
       <w:rPr>
-        <w:rFonts w:hAnsi="Arial Unicode MS"/>
+        <w:rFonts w:ascii="Arial" w:cs="Arial" w:hAnsi="Arial" w:eastAsia="Arial"/>
+        <w:b w:val="0"/>
+        <w:bCs w:val="0"/>
+        <w:i w:val="0"/>
+        <w:iCs w:val="0"/>
         <w:caps w:val="0"/>
         <w:smallCaps w:val="0"/>
         <w:strike w:val="0"/>
@@ -2762,7 +2847,11 @@
         <w:ind w:left="4320" w:hanging="360"/>
       </w:pPr>
       <w:rPr>
-        <w:rFonts w:hAnsi="Arial Unicode MS"/>
+        <w:rFonts w:ascii="Arial" w:cs="Arial" w:hAnsi="Arial" w:eastAsia="Arial"/>
+        <w:b w:val="0"/>
+        <w:bCs w:val="0"/>
+        <w:i w:val="0"/>
+        <w:iCs w:val="0"/>
         <w:caps w:val="0"/>
         <w:smallCaps w:val="0"/>
         <w:strike w:val="0"/>
@@ -2788,7 +2877,11 @@
         <w:ind w:left="5040" w:hanging="360"/>
       </w:pPr>
       <w:rPr>
-        <w:rFonts w:hAnsi="Arial Unicode MS"/>
+        <w:rFonts w:ascii="Arial" w:cs="Arial" w:hAnsi="Arial" w:eastAsia="Arial"/>
+        <w:b w:val="0"/>
+        <w:bCs w:val="0"/>
+        <w:i w:val="0"/>
+        <w:iCs w:val="0"/>
         <w:caps w:val="0"/>
         <w:smallCaps w:val="0"/>
         <w:strike w:val="0"/>
@@ -2814,7 +2907,11 @@
         <w:ind w:left="5760" w:hanging="360"/>
       </w:pPr>
       <w:rPr>
-        <w:rFonts w:hAnsi="Arial Unicode MS"/>
+        <w:rFonts w:ascii="Arial" w:cs="Arial" w:hAnsi="Arial" w:eastAsia="Arial"/>
+        <w:b w:val="0"/>
+        <w:bCs w:val="0"/>
+        <w:i w:val="0"/>
+        <w:iCs w:val="0"/>
         <w:caps w:val="0"/>
         <w:smallCaps w:val="0"/>
         <w:strike w:val="0"/>
@@ -2840,7 +2937,11 @@
         <w:ind w:left="6480" w:hanging="360"/>
       </w:pPr>
       <w:rPr>
-        <w:rFonts w:hAnsi="Arial Unicode MS"/>
+        <w:rFonts w:ascii="Arial" w:cs="Arial" w:hAnsi="Arial" w:eastAsia="Arial"/>
+        <w:b w:val="0"/>
+        <w:bCs w:val="0"/>
+        <w:i w:val="0"/>
+        <w:iCs w:val="0"/>
         <w:caps w:val="0"/>
         <w:smallCaps w:val="0"/>
         <w:strike w:val="0"/>
@@ -3036,7 +3137,7 @@
   </w:style>
   <w:style w:type="paragraph" w:styleId="Title">
     <w:name w:val="Title"/>
-    <w:next w:val="Body"/>
+    <w:next w:val="Body A"/>
     <w:pPr>
       <w:keepNext w:val="1"/>
       <w:keepLines w:val="1"/>
@@ -3071,8 +3172,9 @@
       <w:shd w:val="nil" w:color="auto" w:fill="auto"/>
       <w:vertAlign w:val="baseline"/>
       <w:lang w:val="en-US"/>
-      <w14:textOutline>
+      <w14:textOutline w14:w="12700" w14:cap="flat">
         <w14:noFill/>
+        <w14:miter w14:lim="400000"/>
       </w14:textOutline>
       <w14:textFill>
         <w14:solidFill>
@@ -3081,9 +3183,9 @@
       </w14:textFill>
     </w:rPr>
   </w:style>
-  <w:style w:type="paragraph" w:styleId="Body">
-    <w:name w:val="Body"/>
-    <w:next w:val="Body"/>
+  <w:style w:type="paragraph" w:styleId="Body A">
+    <w:name w:val="Body A"/>
+    <w:next w:val="Body A"/>
     <w:pPr>
       <w:keepNext w:val="0"/>
       <w:keepLines w:val="0"/>
@@ -3117,8 +3219,9 @@
       <w:u w:val="none" w:color="1f1f1f"/>
       <w:shd w:val="nil" w:color="auto" w:fill="auto"/>
       <w:vertAlign w:val="baseline"/>
-      <w14:textOutline>
+      <w14:textOutline w14:w="12700" w14:cap="flat">
         <w14:noFill/>
+        <w14:miter w14:lim="400000"/>
       </w14:textOutline>
       <w14:textFill>
         <w14:solidFill>
@@ -3138,6 +3241,7 @@
       <w:outline w:val="0"/>
       <w:color w:val="1155cc"/>
       <w:u w:val="single" w:color="1155cc"/>
+      <w:lang w:val="nl-NL"/>
       <w14:textFill>
         <w14:solidFill>
           <w14:srgbClr w14:val="1155CC"/>
@@ -3147,7 +3251,7 @@
   </w:style>
   <w:style w:type="paragraph" w:styleId="Heading">
     <w:name w:val="Heading"/>
-    <w:next w:val="Body"/>
+    <w:next w:val="Body A"/>
     <w:pPr>
       <w:keepNext w:val="1"/>
       <w:keepLines w:val="1"/>
@@ -3181,8 +3285,9 @@
       <w:u w:val="none" w:color="1f1f1f"/>
       <w:shd w:val="nil" w:color="auto" w:fill="auto"/>
       <w:vertAlign w:val="baseline"/>
-      <w14:textOutline>
+      <w14:textOutline w14:w="12700" w14:cap="flat">
         <w14:noFill/>
+        <w14:miter w14:lim="400000"/>
       </w14:textOutline>
       <w14:textFill>
         <w14:solidFill>
@@ -3209,7 +3314,7 @@
   </w:style>
   <w:style w:type="paragraph" w:styleId="Heading 2">
     <w:name w:val="Heading 2"/>
-    <w:next w:val="Body"/>
+    <w:next w:val="Body A"/>
     <w:pPr>
       <w:keepNext w:val="1"/>
       <w:keepLines w:val="1"/>
@@ -3243,8 +3348,9 @@
       <w:u w:val="none" w:color="1f1f1f"/>
       <w:shd w:val="nil" w:color="auto" w:fill="auto"/>
       <w:vertAlign w:val="baseline"/>
-      <w14:textOutline>
+      <w14:textOutline w14:w="12700" w14:cap="flat">
         <w14:noFill/>
+        <w14:miter w14:lim="400000"/>
       </w14:textOutline>
       <w14:textFill>
         <w14:solidFill>
@@ -3263,6 +3369,7 @@
       <w:sz w:val="20"/>
       <w:szCs w:val="20"/>
       <w:u w:val="single" w:color="0000ee"/>
+      <w:lang w:val="it-IT"/>
       <w14:textFill>
         <w14:solidFill>
           <w14:srgbClr w14:val="0000EE"/>
@@ -3288,6 +3395,7 @@
       <w:sz w:val="18"/>
       <w:szCs w:val="18"/>
       <w:u w:val="single" w:color="0000ee"/>
+      <w:lang w:val="pt-PT"/>
       <w14:textFill>
         <w14:solidFill>
           <w14:srgbClr w14:val="0000EE"/>
@@ -3443,9 +3551,9 @@
         </a:effectStyle>
         <a:effectStyle>
           <a:effectLst>
-            <a:outerShdw sx="100000" sy="100000" kx="0" ky="0" algn="b" rotWithShape="0" blurRad="38100" dist="20000" dir="5400000">
+            <a:outerShdw sx="100000" sy="100000" kx="0" ky="0" algn="b" rotWithShape="0" blurRad="38100" dist="23000" dir="5400000">
               <a:srgbClr val="000000">
-                <a:alpha val="38000"/>
+                <a:alpha val="35000"/>
               </a:srgbClr>
             </a:outerShdw>
           </a:effectLst>
@@ -3525,7 +3633,7 @@
         </a:effectLst>
         <a:sp3d/>
       </a:spPr>
-      <a:bodyPr rot="0" spcFirstLastPara="1" vertOverflow="overflow" horzOverflow="overflow" vert="horz" wrap="square" lIns="45719" tIns="45719" rIns="45719" bIns="45719" numCol="1" spcCol="38100" rtlCol="0" anchor="ctr" upright="0">
+      <a:bodyPr rot="0" spcFirstLastPara="1" vertOverflow="overflow" horzOverflow="overflow" vert="horz" wrap="square" lIns="45718" tIns="45718" rIns="45718" bIns="45718" numCol="1" spcCol="38100" rtlCol="0" anchor="ctr" upright="0">
         <a:spAutoFit/>
       </a:bodyPr>
       <a:lstStyle>
@@ -3553,10 +3661,10 @@
             </a:solidFill>
             <a:effectLst/>
             <a:uFillTx/>
-            <a:latin typeface="Cambria"/>
-            <a:ea typeface="Cambria"/>
-            <a:cs typeface="Cambria"/>
-            <a:sym typeface="Cambria"/>
+            <a:latin typeface="+mn-lt"/>
+            <a:ea typeface="+mn-ea"/>
+            <a:cs typeface="+mn-cs"/>
+            <a:sym typeface="Helvetica Neue"/>
           </a:defRPr>
         </a:defPPr>
         <a:lvl1pPr marL="0" marR="0" indent="0" algn="l" defTabSz="914400" rtl="0" fontAlgn="auto" latinLnBrk="1" hangingPunct="0">
@@ -3812,9 +3920,9 @@
           <a:round/>
         </a:ln>
         <a:effectLst>
-          <a:outerShdw sx="100000" sy="100000" kx="0" ky="0" algn="b" rotWithShape="0" blurRad="38100" dist="20000" dir="5400000">
+          <a:outerShdw sx="100000" sy="100000" kx="0" ky="0" algn="b" rotWithShape="0" blurRad="38100" dist="23000" dir="5400000">
             <a:srgbClr val="000000">
-              <a:alpha val="38000"/>
+              <a:alpha val="35000"/>
             </a:srgbClr>
           </a:outerShdw>
         </a:effectLst>
@@ -4102,7 +4210,7 @@
         <a:effectLst/>
         <a:sp3d/>
       </a:spPr>
-      <a:bodyPr rot="0" spcFirstLastPara="1" vertOverflow="overflow" horzOverflow="overflow" vert="horz" wrap="square" lIns="45719" tIns="45719" rIns="45719" bIns="45719" numCol="1" spcCol="38100" rtlCol="0" anchor="t" upright="0">
+      <a:bodyPr rot="0" spcFirstLastPara="1" vertOverflow="overflow" horzOverflow="overflow" vert="horz" wrap="square" lIns="45718" tIns="45718" rIns="45718" bIns="45718" numCol="1" spcCol="38100" rtlCol="0" anchor="t" upright="0">
         <a:spAutoFit/>
       </a:bodyPr>
       <a:lstStyle>
@@ -4130,10 +4238,10 @@
             </a:solidFill>
             <a:effectLst/>
             <a:uFillTx/>
-            <a:latin typeface="Cambria"/>
-            <a:ea typeface="Cambria"/>
-            <a:cs typeface="Cambria"/>
-            <a:sym typeface="Cambria"/>
+            <a:latin typeface="+mn-lt"/>
+            <a:ea typeface="+mn-ea"/>
+            <a:cs typeface="+mn-cs"/>
+            <a:sym typeface="Helvetica Neue"/>
           </a:defRPr>
         </a:defPPr>
         <a:lvl1pPr marL="0" marR="0" indent="0" algn="l" defTabSz="914400" rtl="0" fontAlgn="auto" latinLnBrk="1" hangingPunct="0">

</xml_diff>